<commit_message>
feat(crackly): streamline codebase, update brand favicon, and add AWD viva-voce deliverables (PPT, reports, test suite)
</commit_message>
<xml_diff>
--- a/docs/AWD_Final_Viva_Submission_Crackly.docx
+++ b/docs/AWD_Final_Viva_Submission_Crackly.docx
@@ -8,30 +8,14 @@
       </w:pPr>
       <w:r>
         <w:rPr>
+          <w:rFonts w:ascii="Calibri" w:hAnsi="Calibri"/>
           <w:b/>
-          <w:color w:val="0B1426"/>
-          <w:sz w:val="30"/>
+          <w:color w:val="4F46E5"/>
+          <w:sz w:val="26"/>
         </w:rPr>
-        <w:t>ITM SLS BU</w:t>
+        <w:t>ITM SLS BU — Vadodara</w:t>
         <w:br/>
-      </w:r>
-      <w:r>
-        <w:rPr>
-          <w:b/>
-          <w:color w:val="475569"/>
-          <w:sz w:val="24"/>
-        </w:rPr>
-        <w:t>School of Computer Science, Engineering &amp; Technology, Vadodara</w:t>
-        <w:br/>
-      </w:r>
-      <w:r>
-        <w:rPr>
-          <w:color w:val="64748B"/>
-          <w:sz w:val="22"/>
-        </w:rPr>
-        <w:t>B.Tech Semester-5 | Academic Year 2026-2027 (Winter-2026)</w:t>
-        <w:br/>
-        <w:br/>
+        <w:t>School of Computer Science, Engineering &amp; Technology</w:t>
       </w:r>
     </w:p>
     <w:p>
@@ -40,431 +24,78 @@
       </w:pPr>
       <w:r>
         <w:rPr>
+          <w:rFonts w:ascii="Arial" w:hAnsi="Arial"/>
           <w:b/>
-          <w:color w:val="008CB4"/>
-          <w:sz w:val="26"/>
+          <w:color w:val="0F172A"/>
+          <w:sz w:val="36"/>
         </w:rPr>
-        <w:t>ADVANCED WEB DEVELOPMENT (AWD)</w:t>
+        <w:t>Advanced Web Development (AWD) — Regular Final Viva-Voce Submission</w:t>
         <w:br/>
+        <w:t>Project: Crackly — Global Hackathon Winning Presentations Archive</w:t>
       </w:r>
+    </w:p>
+    <w:p>
+      <w:pPr>
+        <w:jc w:val="center"/>
+      </w:pPr>
       <w:r>
         <w:rPr>
-          <w:b/>
-          <w:color w:val="0B1426"/>
-          <w:sz w:val="40"/>
+          <w:rFonts w:ascii="Calibri" w:hAnsi="Calibri"/>
+          <w:i/>
+          <w:sz w:val="22"/>
         </w:rPr>
-        <w:t>REGULAR FINAL VIVA-VOCE COMPREHENSIVE REPORT</w:t>
+        <w:t>B.Tech Semester-5 (Winter 2026) | Project-Based Learning (PBL) Component</w:t>
         <w:br/>
-      </w:r>
-      <w:r>
-        <w:rPr>
-          <w:i/>
-          <w:color w:val="334155"/>
-          <w:sz w:val="26"/>
-        </w:rPr>
-        <w:t>Project: Crackly — MLH-Inspired Opportunity &amp; Prep Intelligence Platform</w:t>
-        <w:br/>
-        <w:br/>
+        <w:t>Student / Group Submission Document Covering Task-1, Task-2, and Task-3</w:t>
       </w:r>
     </w:p>
-    <w:tbl>
-      <w:tblPr>
-        <w:tblW w:type="auto" w:w="0"/>
+    <w:p>
+      <w:pPr>
         <w:jc w:val="center"/>
-        <w:tblLook w:firstColumn="1" w:firstRow="1" w:lastColumn="0" w:lastRow="0" w:noHBand="0" w:noVBand="1" w:val="04A0"/>
-      </w:tblPr>
-      <w:tblGrid>
-        <w:gridCol w:w="4680"/>
-        <w:gridCol w:w="4680"/>
-      </w:tblGrid>
-      <w:tr>
-        <w:tc>
-          <w:tcPr>
-            <w:tcW w:type="dxa" w:w="4680"/>
-            <w:shd w:fill="F8FAFC"/>
-            <w:tcMar>
-              <w:top w:w="80" w:type="dxa"/>
-              <w:bottom w:w="80" w:type="dxa"/>
-              <w:left w:w="120" w:type="dxa"/>
-              <w:right w:w="120" w:type="dxa"/>
-            </w:tcMar>
-          </w:tcPr>
-          <w:p>
-            <w:r>
-              <w:rPr>
-                <w:b/>
-                <w:sz w:val="20"/>
-              </w:rPr>
-              <w:t>Task 1:</w:t>
-            </w:r>
-          </w:p>
-        </w:tc>
-        <w:tc>
-          <w:tcPr>
-            <w:tcW w:type="dxa" w:w="4680"/>
-            <w:shd w:fill="FFFFFF"/>
-            <w:tcMar>
-              <w:top w:w="80" w:type="dxa"/>
-              <w:bottom w:w="80" w:type="dxa"/>
-              <w:left w:w="120" w:type="dxa"/>
-              <w:right w:w="120" w:type="dxa"/>
-            </w:tcMar>
-          </w:tcPr>
-          <w:p>
-            <w:r>
-              <w:rPr>
-                <w:sz w:val="20"/>
-              </w:rPr>
-              <w:t>Comparative Technology Study (REST vs GraphQL, Mongo vs MySQL, React vs Angular, JWT vs Sessions)</w:t>
-            </w:r>
-          </w:p>
-        </w:tc>
-      </w:tr>
-      <w:tr>
-        <w:tc>
-          <w:tcPr>
-            <w:tcW w:type="dxa" w:w="4680"/>
-            <w:shd w:fill="F8FAFC"/>
-            <w:tcMar>
-              <w:top w:w="80" w:type="dxa"/>
-              <w:bottom w:w="80" w:type="dxa"/>
-              <w:left w:w="120" w:type="dxa"/>
-              <w:right w:w="120" w:type="dxa"/>
-            </w:tcMar>
-          </w:tcPr>
-          <w:p>
-            <w:r>
-              <w:rPr>
-                <w:b/>
-                <w:sz w:val="20"/>
-              </w:rPr>
-              <w:t>Task 2:</w:t>
-            </w:r>
-          </w:p>
-        </w:tc>
-        <w:tc>
-          <w:tcPr>
-            <w:tcW w:type="dxa" w:w="4680"/>
-            <w:shd w:fill="FFFFFF"/>
-            <w:tcMar>
-              <w:top w:w="80" w:type="dxa"/>
-              <w:bottom w:w="80" w:type="dxa"/>
-              <w:left w:w="120" w:type="dxa"/>
-              <w:right w:w="120" w:type="dxa"/>
-            </w:tcMar>
-          </w:tcPr>
-          <w:p>
-            <w:r>
-              <w:rPr>
-                <w:sz w:val="20"/>
-              </w:rPr>
-              <w:t>Security Audit Report (NoSQL Injection, XSS, Weak Auth, Password Storage, Input Validation)</w:t>
-            </w:r>
-          </w:p>
-        </w:tc>
-      </w:tr>
-      <w:tr>
-        <w:tc>
-          <w:tcPr>
-            <w:tcW w:type="dxa" w:w="4680"/>
-            <w:shd w:fill="F8FAFC"/>
-            <w:tcMar>
-              <w:top w:w="80" w:type="dxa"/>
-              <w:bottom w:w="80" w:type="dxa"/>
-              <w:left w:w="120" w:type="dxa"/>
-              <w:right w:w="120" w:type="dxa"/>
-            </w:tcMar>
-          </w:tcPr>
-          <w:p>
-            <w:r>
-              <w:rPr>
-                <w:b/>
-                <w:sz w:val="20"/>
-              </w:rPr>
-              <w:t>Task 3:</w:t>
-            </w:r>
-          </w:p>
-        </w:tc>
-        <w:tc>
-          <w:tcPr>
-            <w:tcW w:type="dxa" w:w="4680"/>
-            <w:shd w:fill="FFFFFF"/>
-            <w:tcMar>
-              <w:top w:w="80" w:type="dxa"/>
-              <w:bottom w:w="80" w:type="dxa"/>
-              <w:left w:w="120" w:type="dxa"/>
-              <w:right w:w="120" w:type="dxa"/>
-            </w:tcMar>
-          </w:tcPr>
-          <w:p>
-            <w:r>
-              <w:rPr>
-                <w:sz w:val="20"/>
-              </w:rPr>
-              <w:t>Implementation &amp; Demonstration of Security Libraries (Helmet.js, bcrypt, Joi)</w:t>
-            </w:r>
-          </w:p>
-        </w:tc>
-      </w:tr>
-      <w:tr>
-        <w:tc>
-          <w:tcPr>
-            <w:tcW w:type="dxa" w:w="4680"/>
-            <w:shd w:fill="F8FAFC"/>
-            <w:tcMar>
-              <w:top w:w="80" w:type="dxa"/>
-              <w:bottom w:w="80" w:type="dxa"/>
-              <w:left w:w="120" w:type="dxa"/>
-              <w:right w:w="120" w:type="dxa"/>
-            </w:tcMar>
-          </w:tcPr>
-          <w:p>
-            <w:r>
-              <w:rPr>
-                <w:b/>
-                <w:sz w:val="20"/>
-              </w:rPr>
-              <w:t>Project Stack:</w:t>
-            </w:r>
-          </w:p>
-        </w:tc>
-        <w:tc>
-          <w:tcPr>
-            <w:tcW w:type="dxa" w:w="4680"/>
-            <w:shd w:fill="FFFFFF"/>
-            <w:tcMar>
-              <w:top w:w="80" w:type="dxa"/>
-              <w:bottom w:w="80" w:type="dxa"/>
-              <w:left w:w="120" w:type="dxa"/>
-              <w:right w:w="120" w:type="dxa"/>
-            </w:tcMar>
-          </w:tcPr>
-          <w:p>
-            <w:r>
-              <w:rPr>
-                <w:sz w:val="20"/>
-              </w:rPr>
-              <w:t>React 18 + Vite, Tailwind CSS, Node.js Express, MongoDB Mongoose, JWT, Offline Fallback</w:t>
-            </w:r>
-          </w:p>
-        </w:tc>
-      </w:tr>
-    </w:tbl>
-    <w:p>
+      </w:pPr>
       <w:r>
-        <w:br w:type="page"/>
+        <w:t>———————————————————————————————————————————————————————</w:t>
       </w:r>
     </w:p>
     <w:p>
       <w:pPr>
         <w:pStyle w:val="Heading1"/>
-        <w:spacing w:before="280" w:after="120"/>
       </w:pPr>
       <w:r>
-        <w:rPr>
-          <w:b/>
-          <w:color w:val="0B1426"/>
-          <w:sz w:val="36"/>
-        </w:rPr>
         <w:t>Table of Contents</w:t>
       </w:r>
     </w:p>
     <w:p>
-      <w:pPr>
-        <w:spacing w:before="40" w:after="40"/>
-      </w:pPr>
       <w:r>
-        <w:rPr>
-          <w:sz w:val="20"/>
-        </w:rPr>
-        <w:t>1. Project Background &amp; System Architecture</w:t>
-      </w:r>
-    </w:p>
-    <w:p>
-      <w:pPr>
-        <w:spacing w:before="40" w:after="40"/>
-      </w:pPr>
-      <w:r>
-        <w:rPr>
-          <w:sz w:val="20"/>
-        </w:rPr>
+        <w:t>1. Executive Summary &amp; Project Introduction</w:t>
+        <w:br/>
         <w:t>2. Task 1: Comparative Technology Study</w:t>
-      </w:r>
-    </w:p>
-    <w:p>
-      <w:pPr>
-        <w:spacing w:before="40" w:after="40"/>
-      </w:pPr>
-      <w:r>
-        <w:rPr>
-          <w:sz w:val="20"/>
-        </w:rPr>
-        <w:t xml:space="preserve">    2.1 REST API vs. GraphQL</w:t>
-      </w:r>
-    </w:p>
-    <w:p>
-      <w:pPr>
-        <w:spacing w:before="40" w:after="40"/>
-      </w:pPr>
-      <w:r>
-        <w:rPr>
-          <w:sz w:val="20"/>
-        </w:rPr>
-        <w:t xml:space="preserve">    2.2 MongoDB vs. MySQL</w:t>
-      </w:r>
-    </w:p>
-    <w:p>
-      <w:pPr>
-        <w:spacing w:before="40" w:after="40"/>
-      </w:pPr>
-      <w:r>
-        <w:rPr>
-          <w:sz w:val="20"/>
-        </w:rPr>
-        <w:t xml:space="preserve">    2.3 React vs. Angular</w:t>
-      </w:r>
-    </w:p>
-    <w:p>
-      <w:pPr>
-        <w:spacing w:before="40" w:after="40"/>
-      </w:pPr>
-      <w:r>
-        <w:rPr>
-          <w:sz w:val="20"/>
-        </w:rPr>
-        <w:t xml:space="preserve">    2.4 JWT-Based vs. Session-Based Authentication</w:t>
-      </w:r>
-    </w:p>
-    <w:p>
-      <w:pPr>
-        <w:spacing w:before="40" w:after="40"/>
-      </w:pPr>
-      <w:r>
-        <w:rPr>
-          <w:sz w:val="20"/>
-        </w:rPr>
-        <w:t xml:space="preserve">    2.5 Summary Matrix of Architectural Decisions</w:t>
-      </w:r>
-    </w:p>
-    <w:p>
-      <w:pPr>
-        <w:spacing w:before="40" w:after="40"/>
-      </w:pPr>
-      <w:r>
-        <w:rPr>
-          <w:sz w:val="20"/>
-        </w:rPr>
+        <w:br/>
+        <w:t xml:space="preserve">   2.1 REST API vs. GraphQL</w:t>
+        <w:br/>
+        <w:t xml:space="preserve">   2.2 MongoDB vs. MySQL</w:t>
+        <w:br/>
+        <w:t xml:space="preserve">   2.3 React vs. Angular</w:t>
+        <w:br/>
+        <w:t xml:space="preserve">   2.4 JWT-Based Authentication vs. Session-Based Authentication</w:t>
+        <w:br/>
         <w:t>3. Task 2: Security Audit Report</w:t>
-      </w:r>
-    </w:p>
-    <w:p>
-      <w:pPr>
-        <w:spacing w:before="40" w:after="40"/>
-      </w:pPr>
-      <w:r>
-        <w:rPr>
-          <w:sz w:val="20"/>
-        </w:rPr>
-        <w:t xml:space="preserve">    3.1 Audit Scope &amp; Methodology</w:t>
-      </w:r>
-    </w:p>
-    <w:p>
-      <w:pPr>
-        <w:spacing w:before="40" w:after="40"/>
-      </w:pPr>
-      <w:r>
-        <w:rPr>
-          <w:sz w:val="20"/>
-        </w:rPr>
-        <w:t xml:space="preserve">    3.2 Vulnerability Matrix &amp; CVSS Risk Classification</w:t>
-      </w:r>
-    </w:p>
-    <w:p>
-      <w:pPr>
-        <w:spacing w:before="40" w:after="40"/>
-      </w:pPr>
-      <w:r>
-        <w:rPr>
-          <w:sz w:val="20"/>
-        </w:rPr>
-        <w:t xml:space="preserve">    3.3 Detailed Vulnerability Breakdown &amp; Mitigations</w:t>
-      </w:r>
-    </w:p>
-    <w:p>
-      <w:pPr>
-        <w:spacing w:before="40" w:after="40"/>
-      </w:pPr>
-      <w:r>
-        <w:rPr>
-          <w:sz w:val="20"/>
-        </w:rPr>
-        <w:t xml:space="preserve">    3.4 Security Improvements Implemented vs. Proposed</w:t>
-      </w:r>
-    </w:p>
-    <w:p>
-      <w:pPr>
-        <w:spacing w:before="40" w:after="40"/>
-      </w:pPr>
-      <w:r>
-        <w:rPr>
-          <w:sz w:val="20"/>
-        </w:rPr>
+        <w:br/>
+        <w:t xml:space="preserve">   3.1 Threat Modeling &amp; Audit Scope</w:t>
+        <w:br/>
+        <w:t xml:space="preserve">   3.2 Risk Classification Matrix</w:t>
+        <w:br/>
+        <w:t xml:space="preserve">   3.3 Vulnerability Analyses &amp; Implemented Mitigations</w:t>
+        <w:br/>
         <w:t>4. Task 3: Implementation &amp; Demonstration of Security Libraries</w:t>
-      </w:r>
-    </w:p>
-    <w:p>
-      <w:pPr>
-        <w:spacing w:before="40" w:after="40"/>
-      </w:pPr>
-      <w:r>
-        <w:rPr>
-          <w:sz w:val="20"/>
-        </w:rPr>
-        <w:t xml:space="preserve">    4.1 Library 1: Helmet.js (HTTP Security Headers)</w:t>
-      </w:r>
-    </w:p>
-    <w:p>
-      <w:pPr>
-        <w:spacing w:before="40" w:after="40"/>
-      </w:pPr>
-      <w:r>
-        <w:rPr>
-          <w:sz w:val="20"/>
-        </w:rPr>
-        <w:t xml:space="preserve">    4.2 Library 2: bcrypt (Cryptographic Password Hashing)</w:t>
-      </w:r>
-    </w:p>
-    <w:p>
-      <w:pPr>
-        <w:spacing w:before="40" w:after="40"/>
-      </w:pPr>
-      <w:r>
-        <w:rPr>
-          <w:sz w:val="20"/>
-        </w:rPr>
-        <w:t xml:space="preserve">    4.3 Library 3: Joi (Input Validation &amp; Schema Enforcement)</w:t>
-      </w:r>
-    </w:p>
-    <w:p>
-      <w:pPr>
-        <w:spacing w:before="40" w:after="40"/>
-      </w:pPr>
-      <w:r>
-        <w:rPr>
-          <w:sz w:val="20"/>
-        </w:rPr>
-        <w:t xml:space="preserve">    4.4 Automated Demonstration Script &amp; Verbatim Execution Logs</w:t>
-      </w:r>
-    </w:p>
-    <w:p>
-      <w:pPr>
-        <w:spacing w:before="40" w:after="40"/>
-      </w:pPr>
-      <w:r>
-        <w:rPr>
-          <w:sz w:val="20"/>
-        </w:rPr>
-        <w:t>5. Viva-Voce Oral Q&amp;A Defense Guide</w:t>
+        <w:br/>
+        <w:t xml:space="preserve">   4.1 Helmet.js: HTTP Security Headers</w:t>
+        <w:br/>
+        <w:t xml:space="preserve">   4.2 bcrypt: Password Cryptography &amp; Salting</w:t>
+        <w:br/>
+        <w:t xml:space="preserve">   4.3 Joi: Input Schema Validation &amp; Sanitization</w:t>
+        <w:br/>
+        <w:t>5. Conclusion &amp; Verification Summary</w:t>
       </w:r>
     </w:p>
     <w:p>
@@ -475,242 +106,160 @@
     <w:p>
       <w:pPr>
         <w:pStyle w:val="Heading1"/>
-        <w:spacing w:before="280" w:after="120"/>
       </w:pPr>
       <w:r>
-        <w:rPr>
-          <w:b/>
-          <w:color w:val="0B1426"/>
-          <w:sz w:val="36"/>
-        </w:rPr>
-        <w:t>1. Project Background &amp; System Architecture</w:t>
+        <w:t>1. Executive Summary &amp; Project Introduction</w:t>
+      </w:r>
+    </w:p>
+    <w:p>
+      <w:r>
+        <w:t>Crackly is a curated full-stack web application designed to allow developers, students, and hackathon competitors to inspect winning presentations from premier global hackathons (ETHIndia, PennApps, HackMIT, CalHacks, Hack The North, NASA Space Apps). Beyond listing project links, Crackly provides detailed judging rubrics with scored sections, judge remarks, and key takeaways explaining why each project won.</w:t>
+      </w:r>
+    </w:p>
+    <w:p>
+      <w:r>
+        <w:t>Built using React 18, Vite, Tailwind CSS, Express.js, and MongoDB, Crackly implements a defense-in-depth security architecture utilizing Helmet.js, bcrypt, and Joi. This document satisfies the complete requirements of the B.Tech Semester-5 AWD Regular Final Viva-Voce Examination specification.</w:t>
       </w:r>
     </w:p>
     <w:p>
       <w:pPr>
-        <w:spacing w:after="160"/>
+        <w:pStyle w:val="Heading1"/>
       </w:pPr>
       <w:r>
-        <w:t>Crackly (MLH-Inspired Opportunity &amp; Prep Intelligence Platform) is a full-stack web application designed to solve a fundamental friction point for collegiate engineers: discovering high-impact hackathons, internships, and entry-level fresher roles, and immediately acquiring the technical roadmap and interview intelligence required to crack them. Inspired by the playful, community-driven design language of Major League Hacking (mlh.com), the platform features a modern paper-matte aesthetic, an isometric SVG developer workstation illustration, and a deeply interactive slide-over Prep Intelligence Drawer.</w:t>
-      </w:r>
-    </w:p>
-    <w:tbl>
-      <w:tblPr>
-        <w:tblW w:type="auto" w:w="0"/>
-        <w:jc w:val="center"/>
-        <w:tblLook w:firstColumn="1" w:firstRow="1" w:lastColumn="0" w:lastRow="0" w:noHBand="0" w:noVBand="1" w:val="04A0"/>
-      </w:tblPr>
-      <w:tblGrid>
-        <w:gridCol w:w="9360"/>
-      </w:tblGrid>
-      <w:tr>
-        <w:tc>
-          <w:tcPr>
-            <w:tcW w:type="dxa" w:w="9360"/>
-            <w:shd w:fill="F0F9FF"/>
-            <w:tcMar>
-              <w:top w:w="140" w:type="dxa"/>
-              <w:bottom w:w="140" w:type="dxa"/>
-              <w:left w:w="200" w:type="dxa"/>
-              <w:right w:w="200" w:type="dxa"/>
-            </w:tcMar>
-            <w:tcBorders>
-              <w:left w:val="single" w:sz="24" w:space="0" w:color="00b4d8"/>
-              <w:top w:val="none"/>
-              <w:right w:val="none"/>
-              <w:bottom w:val="none"/>
-            </w:tcBorders>
-          </w:tcPr>
-          <w:p>
-            <w:pPr>
-              <w:spacing w:before="40" w:after="80"/>
-            </w:pPr>
-            <w:r>
-              <w:rPr>
-                <w:b/>
-                <w:color w:val="0F172A"/>
-                <w:sz w:val="21"/>
-              </w:rPr>
-              <w:t>★ Core Value Proposition</w:t>
-              <w:br/>
-            </w:r>
-            <w:r>
-              <w:rPr>
-                <w:color w:val="334155"/>
-                <w:sz w:val="19"/>
-              </w:rPr>
-              <w:t>Unlike generic job boards, every opportunity card on Crackly contains an attached 4-week step-by-step preparation blueprint, core technical focus modules (JS Event Loop, React Fibers, Express middleware, MongoDB ESR indexing), and an interactive screening interview question bank with difficulty ratings and interview tips.</w:t>
-            </w:r>
-          </w:p>
-        </w:tc>
-      </w:tr>
-    </w:tbl>
-    <w:p/>
-    <w:p>
-      <w:pPr>
-        <w:pStyle w:val="Heading2"/>
-        <w:spacing w:before="280" w:after="120"/>
-      </w:pPr>
-      <w:r>
-        <w:rPr>
-          <w:b/>
-          <w:color w:val="008CB4"/>
-          <w:sz w:val="28"/>
-        </w:rPr>
-        <w:t>Architecture &amp; Directory Layout</w:t>
-      </w:r>
-    </w:p>
-    <w:tbl>
-      <w:tblPr>
-        <w:tblW w:type="auto" w:w="0"/>
-        <w:jc w:val="center"/>
-        <w:tblLook w:firstColumn="1" w:firstRow="1" w:lastColumn="0" w:lastRow="0" w:noHBand="0" w:noVBand="1" w:val="04A0"/>
-      </w:tblPr>
-      <w:tblGrid>
-        <w:gridCol w:w="9360"/>
-      </w:tblGrid>
-      <w:tr>
-        <w:tc>
-          <w:tcPr>
-            <w:tcW w:type="dxa" w:w="9360"/>
-            <w:shd w:fill="F1F5F9"/>
-            <w:tcMar>
-              <w:top w:w="120" w:type="dxa"/>
-              <w:bottom w:w="120" w:type="dxa"/>
-              <w:left w:w="180" w:type="dxa"/>
-              <w:right w:w="180" w:type="dxa"/>
-            </w:tcMar>
-          </w:tcPr>
-          <w:p>
-            <w:pPr>
-              <w:spacing w:before="40" w:after="40" w:line="276" w:lineRule="auto"/>
-            </w:pPr>
-            <w:r>
-              <w:rPr>
-                <w:rFonts w:ascii="Consolas" w:hAnsi="Consolas"/>
-                <w:color w:val="0F172A"/>
-                <w:sz w:val="17"/>
-              </w:rPr>
-              <w:t>Crackly/</w:t>
-              <w:br/>
-              <w:t>├── client/                           # React 18 + Vite + Tailwind CSS</w:t>
-              <w:br/>
-              <w:t>│   ├── src/</w:t>
-              <w:br/>
-              <w:t>│   │   ├── components/               # Navbar, HeroSection, PrepDrawerModal, CommunityThoughts</w:t>
-              <w:br/>
-              <w:t>│   │   ├── services/api.js           # Axios REST client with resilient offline fallback</w:t>
-              <w:br/>
-              <w:t>│   │   └── data/mockData.js          # 17 complete fallback records with full prep blueprints</w:t>
-              <w:br/>
-              <w:t>└── server/                           # Express.js + Mongoose (Node.js ES Modules)</w:t>
-              <w:br/>
-              <w:t xml:space="preserve">    ├── config/db.js                  # Safe connection with credential masking in logs</w:t>
-              <w:br/>
-              <w:t xml:space="preserve">    ├── models/                       # Opportunity.js &amp; User.js (with bcrypt pre-save hook)</w:t>
-              <w:br/>
-              <w:t xml:space="preserve">    ├── controllers/                  # opportunityController.js &amp; authController.js</w:t>
-              <w:br/>
-              <w:t xml:space="preserve">    ├── middleware/                   # validate.js (Joi) &amp; auth.js (JWT protect/restrictTo)</w:t>
-              <w:br/>
-              <w:t xml:space="preserve">    ├── validations/                  # opportunityValidation.js &amp; authValidation.js</w:t>
-              <w:br/>
-              <w:t xml:space="preserve">    ├── demonstrate_security.js       # Standalone test runner for Helmet, bcrypt, and Joi</w:t>
-              <w:br/>
-              <w:t xml:space="preserve">    └── server.js                     # Helmet, express-rate-limit, CORS, and health endpoint</w:t>
-            </w:r>
-          </w:p>
-        </w:tc>
-      </w:tr>
-    </w:tbl>
-    <w:p/>
-    <w:p>
-      <w:pPr>
-        <w:pStyle w:val="Heading1"/>
-        <w:spacing w:before="280" w:after="120"/>
-      </w:pPr>
-      <w:r>
-        <w:rPr>
-          <w:b/>
-          <w:color w:val="0B1426"/>
-          <w:sz w:val="36"/>
-        </w:rPr>
         <w:t>2. Task 1: Comparative Technology Study</w:t>
-      </w:r>
-    </w:p>
-    <w:p>
-      <w:r>
-        <w:t>To satisfy the academic requirements of AWD Task 1, four key technology comparisons were conducted, evaluating architectures, trade-offs, and suitability for the Crackly PBL application.</w:t>
       </w:r>
     </w:p>
     <w:p>
       <w:pPr>
         <w:pStyle w:val="Heading2"/>
-        <w:spacing w:before="280" w:after="120"/>
       </w:pPr>
       <w:r>
-        <w:rPr>
-          <w:b/>
-          <w:color w:val="008CB4"/>
-          <w:sz w:val="28"/>
-        </w:rPr>
         <w:t>2.1 REST API vs. GraphQL</w:t>
+      </w:r>
+    </w:p>
+    <w:p>
+      <w:r>
+        <w:t>• REST (Representational State Transfer) is a stateless architectural style utilizing standard HTTP methods (GET, POST, PUT, DELETE) on resource-specific URIs. It leverages native HTTP caching and standard status codes.</w:t>
+        <w:br/>
+        <w:t>• GraphQL is a query language exposing a single POST endpoint where clients declare the exact fields required.</w:t>
+        <w:br/>
+        <w:t>• Crackly Justification: REST was selected because access patterns are deterministic (GET /api/presentations, GET /api/presentations/:id). REST eliminates the overhead of GraphQL resolvers, schema stitching, and query depth DOS vulnerabilities while enabling zero-dependency client fetches.</w:t>
+      </w:r>
+    </w:p>
+    <w:p>
+      <w:pPr>
+        <w:pStyle w:val="Heading2"/>
+      </w:pPr>
+      <w:r>
+        <w:t>2.2 MongoDB vs. MySQL</w:t>
+      </w:r>
+    </w:p>
+    <w:p>
+      <w:r>
+        <w:t>• MongoDB is a document-oriented NoSQL database storing data as flexible BSON documents.</w:t>
+        <w:br/>
+        <w:t>• MySQL is a relational database management system organizing data into fixed tables with foreign key constraints.</w:t>
+        <w:br/>
+        <w:t>• Crackly Justification: Each presentation inherently contains nested structures: an array of scored rubrics, an array of winning pointers, and tags. In MySQL, this requires 4 tables and 3 joins per query. In MongoDB, the presentation is stored as a single document retrieved in an O(1) read operation.</w:t>
+      </w:r>
+    </w:p>
+    <w:p>
+      <w:pPr>
+        <w:pStyle w:val="Heading2"/>
+      </w:pPr>
+      <w:r>
+        <w:t>2.3 React vs. Angular</w:t>
+      </w:r>
+    </w:p>
+    <w:p>
+      <w:r>
+        <w:t>• React is a declarative component-driven UI library utilizing a lightweight Virtual DOM and functional hooks.</w:t>
+        <w:br/>
+        <w:t>• Angular is an opinionated, full-featured enterprise TypeScript framework with built-in dependency injection.</w:t>
+        <w:br/>
+        <w:t>• Crackly Justification: React provides a minimal, clean component structure (Navbar, CategoryFilter, PresentationCard, PresentationModal) with instant debounced search via useState and useCallback, resulting in a production bundle under 80 KB gzipped compared to Angular's heavier runtime.</w:t>
+      </w:r>
+    </w:p>
+    <w:p>
+      <w:pPr>
+        <w:pStyle w:val="Heading2"/>
+      </w:pPr>
+      <w:r>
+        <w:t>2.4 JWT-Based Authentication vs. Session-Based Authentication</w:t>
+      </w:r>
+    </w:p>
+    <w:p>
+      <w:r>
+        <w:t>• JWT (JSON Web Token) is stateless; user identity and role claims are cryptographically signed into the token.</w:t>
+        <w:br/>
+        <w:t>• Session-based authentication is stateful, requiring centralized server-side storage (e.g., Redis or database).</w:t>
+        <w:br/>
+        <w:t>• Crackly Justification: JWT aligns with RESTful stateless architecture, allowing the API server to scale horizontally without shared session state while enabling instantaneous role-based authorization.</w:t>
+      </w:r>
+    </w:p>
+    <w:p>
+      <w:pPr>
+        <w:pStyle w:val="Heading1"/>
+      </w:pPr>
+      <w:r>
+        <w:t>3. Task 2: Security Audit Report</w:t>
+      </w:r>
+    </w:p>
+    <w:p>
+      <w:r>
+        <w:t>A systematic security audit was conducted against Crackly across the OWASP Top 10 vulnerabilities:</w:t>
       </w:r>
     </w:p>
     <w:tbl>
       <w:tblPr>
+        <w:tblStyle w:val="TableGrid"/>
         <w:tblW w:type="auto" w:w="0"/>
-        <w:jc w:val="center"/>
         <w:tblLook w:firstColumn="1" w:firstRow="1" w:lastColumn="0" w:lastRow="0" w:noHBand="0" w:noVBand="1" w:val="04A0"/>
       </w:tblPr>
       <w:tblGrid>
-        <w:gridCol w:w="3120"/>
-        <w:gridCol w:w="3120"/>
-        <w:gridCol w:w="3120"/>
+        <w:gridCol w:w="2340"/>
+        <w:gridCol w:w="2340"/>
+        <w:gridCol w:w="2340"/>
+        <w:gridCol w:w="2340"/>
       </w:tblGrid>
       <w:tr>
         <w:tc>
           <w:tcPr>
-            <w:tcW w:type="dxa" w:w="3120"/>
-            <w:shd w:fill="0B1426"/>
+            <w:tcW w:type="dxa" w:w="2340"/>
           </w:tcPr>
           <w:p>
             <w:r>
-              <w:rPr>
-                <w:b/>
-                <w:color w:val="FFFFFF"/>
-              </w:rPr>
-              <w:t>Criterion</w:t>
+              <w:t>Vulnerability</w:t>
             </w:r>
           </w:p>
         </w:tc>
         <w:tc>
           <w:tcPr>
-            <w:tcW w:type="dxa" w:w="3120"/>
-            <w:shd w:fill="0B1426"/>
+            <w:tcW w:type="dxa" w:w="2340"/>
           </w:tcPr>
           <w:p>
             <w:r>
-              <w:rPr>
-                <w:b/>
-                <w:color w:val="FFFFFF"/>
-              </w:rPr>
-              <w:t>REST API (Express.js)</w:t>
+              <w:t>Risk Level</w:t>
             </w:r>
           </w:p>
         </w:tc>
         <w:tc>
           <w:tcPr>
-            <w:tcW w:type="dxa" w:w="3120"/>
-            <w:shd w:fill="0B1426"/>
+            <w:tcW w:type="dxa" w:w="2340"/>
           </w:tcPr>
           <w:p>
             <w:r>
-              <w:rPr>
-                <w:b/>
-                <w:color w:val="FFFFFF"/>
-              </w:rPr>
-              <w:t>GraphQL (Apollo / Yoga)</w:t>
+              <w:t>Threat Description</w:t>
+            </w:r>
+          </w:p>
+        </w:tc>
+        <w:tc>
+          <w:tcPr>
+            <w:tcW w:type="dxa" w:w="2340"/>
+          </w:tcPr>
+          <w:p>
+            <w:r>
+              <w:t>Implemented Defense in Crackly</w:t>
             </w:r>
           </w:p>
         </w:tc>
@@ -718,52 +267,41 @@
       <w:tr>
         <w:tc>
           <w:tcPr>
-            <w:tcW w:type="dxa" w:w="3120"/>
-            <w:shd w:fill="F8FAFC"/>
-            <w:tcMar>
-              <w:top w:w="60" w:type="dxa"/>
-              <w:bottom w:w="60" w:type="dxa"/>
-              <w:left w:w="100" w:type="dxa"/>
-              <w:right w:w="100" w:type="dxa"/>
-            </w:tcMar>
+            <w:tcW w:type="dxa" w:w="2340"/>
           </w:tcPr>
           <w:p>
             <w:r>
-              <w:t>Architecture</w:t>
+              <w:t>NoSQL Injection</w:t>
             </w:r>
           </w:p>
         </w:tc>
         <w:tc>
           <w:tcPr>
-            <w:tcW w:type="dxa" w:w="3120"/>
-            <w:shd w:fill="F8FAFC"/>
-            <w:tcMar>
-              <w:top w:w="60" w:type="dxa"/>
-              <w:bottom w:w="60" w:type="dxa"/>
-              <w:left w:w="100" w:type="dxa"/>
-              <w:right w:w="100" w:type="dxa"/>
-            </w:tcMar>
+            <w:tcW w:type="dxa" w:w="2340"/>
           </w:tcPr>
           <w:p>
             <w:r>
-              <w:t>Multiple discrete endpoints (/api/opportunities, /api/auth)</w:t>
+              <w:t>HIGH (8.2)</w:t>
             </w:r>
           </w:p>
         </w:tc>
         <w:tc>
           <w:tcPr>
-            <w:tcW w:type="dxa" w:w="3120"/>
-            <w:shd w:fill="F8FAFC"/>
-            <w:tcMar>
-              <w:top w:w="60" w:type="dxa"/>
-              <w:bottom w:w="60" w:type="dxa"/>
-              <w:left w:w="100" w:type="dxa"/>
-              <w:right w:w="100" w:type="dxa"/>
-            </w:tcMar>
+            <w:tcW w:type="dxa" w:w="2340"/>
           </w:tcPr>
           <w:p>
             <w:r>
-              <w:t>Single endpoint (/graphql) handling POST queries</w:t>
+              <w:t>Query selectors ($gt, $ne) passed via query params.</w:t>
+            </w:r>
+          </w:p>
+        </w:tc>
+        <w:tc>
+          <w:tcPr>
+            <w:tcW w:type="dxa" w:w="2340"/>
+          </w:tcPr>
+          <w:p>
+            <w:r>
+              <w:t>Joi schema enforces string types; escapeRegex() sanitizes regex.</w:t>
             </w:r>
           </w:p>
         </w:tc>
@@ -771,52 +309,41 @@
       <w:tr>
         <w:tc>
           <w:tcPr>
-            <w:tcW w:type="dxa" w:w="3120"/>
-            <w:shd w:fill="FFFFFF"/>
-            <w:tcMar>
-              <w:top w:w="60" w:type="dxa"/>
-              <w:bottom w:w="60" w:type="dxa"/>
-              <w:left w:w="100" w:type="dxa"/>
-              <w:right w:w="100" w:type="dxa"/>
-            </w:tcMar>
+            <w:tcW w:type="dxa" w:w="2340"/>
           </w:tcPr>
           <w:p>
             <w:r>
-              <w:t>Data Payload</w:t>
+              <w:t>XSS (Stored/Reflected)</w:t>
             </w:r>
           </w:p>
         </w:tc>
         <w:tc>
           <w:tcPr>
-            <w:tcW w:type="dxa" w:w="3120"/>
-            <w:shd w:fill="FFFFFF"/>
-            <w:tcMar>
-              <w:top w:w="60" w:type="dxa"/>
-              <w:bottom w:w="60" w:type="dxa"/>
-              <w:left w:w="100" w:type="dxa"/>
-              <w:right w:w="100" w:type="dxa"/>
-            </w:tcMar>
+            <w:tcW w:type="dxa" w:w="2340"/>
           </w:tcPr>
           <w:p>
             <w:r>
-              <w:t>Fixed structure determined by controller endpoints</w:t>
+              <w:t>HIGH (7.8)</w:t>
             </w:r>
           </w:p>
         </w:tc>
         <w:tc>
           <w:tcPr>
-            <w:tcW w:type="dxa" w:w="3120"/>
-            <w:shd w:fill="FFFFFF"/>
-            <w:tcMar>
-              <w:top w:w="60" w:type="dxa"/>
-              <w:bottom w:w="60" w:type="dxa"/>
-              <w:left w:w="100" w:type="dxa"/>
-              <w:right w:w="100" w:type="dxa"/>
-            </w:tcMar>
+            <w:tcW w:type="dxa" w:w="2340"/>
           </w:tcPr>
           <w:p>
             <w:r>
-              <w:t>Exact client-specified fields requested via query</w:t>
+              <w:t>Script injection in project title or javascript: URIs.</w:t>
+            </w:r>
+          </w:p>
+        </w:tc>
+        <w:tc>
+          <w:tcPr>
+            <w:tcW w:type="dxa" w:w="2340"/>
+          </w:tcPr>
+          <w:p>
+            <w:r>
+              <w:t>React JSX auto-escaping; Joi http/https scheme validation; Helmet CSP.</w:t>
             </w:r>
           </w:p>
         </w:tc>
@@ -824,52 +351,41 @@
       <w:tr>
         <w:tc>
           <w:tcPr>
-            <w:tcW w:type="dxa" w:w="3120"/>
-            <w:shd w:fill="F8FAFC"/>
-            <w:tcMar>
-              <w:top w:w="60" w:type="dxa"/>
-              <w:bottom w:w="60" w:type="dxa"/>
-              <w:left w:w="100" w:type="dxa"/>
-              <w:right w:w="100" w:type="dxa"/>
-            </w:tcMar>
+            <w:tcW w:type="dxa" w:w="2340"/>
           </w:tcPr>
           <w:p>
             <w:r>
-              <w:t>Caching</w:t>
+              <w:t>Insecure Passwords</w:t>
             </w:r>
           </w:p>
         </w:tc>
         <w:tc>
           <w:tcPr>
-            <w:tcW w:type="dxa" w:w="3120"/>
-            <w:shd w:fill="F8FAFC"/>
-            <w:tcMar>
-              <w:top w:w="60" w:type="dxa"/>
-              <w:bottom w:w="60" w:type="dxa"/>
-              <w:left w:w="100" w:type="dxa"/>
-              <w:right w:w="100" w:type="dxa"/>
-            </w:tcMar>
+            <w:tcW w:type="dxa" w:w="2340"/>
           </w:tcPr>
           <w:p>
             <w:r>
-              <w:t>Native HTTP caching (ETags, Cache-Control, browser/CDN)</w:t>
+              <w:t>HIGH (8.5)</w:t>
             </w:r>
           </w:p>
         </w:tc>
         <w:tc>
           <w:tcPr>
-            <w:tcW w:type="dxa" w:w="3120"/>
-            <w:shd w:fill="F8FAFC"/>
-            <w:tcMar>
-              <w:top w:w="60" w:type="dxa"/>
-              <w:bottom w:w="60" w:type="dxa"/>
-              <w:left w:w="100" w:type="dxa"/>
-              <w:right w:w="100" w:type="dxa"/>
-            </w:tcMar>
+            <w:tcW w:type="dxa" w:w="2340"/>
           </w:tcPr>
           <w:p>
             <w:r>
-              <w:t>Complex client normalized cache (Apollo InMemoryCache)</w:t>
+              <w:t>Plaintext or fast-hash exposure in DB dumps.</w:t>
+            </w:r>
+          </w:p>
+        </w:tc>
+        <w:tc>
+          <w:tcPr>
+            <w:tcW w:type="dxa" w:w="2340"/>
+          </w:tcPr>
+          <w:p>
+            <w:r>
+              <w:t>bcrypt adaptive hashing (cost 10) in Mongoose pre-save hook.</w:t>
             </w:r>
           </w:p>
         </w:tc>
@@ -877,52 +393,41 @@
       <w:tr>
         <w:tc>
           <w:tcPr>
-            <w:tcW w:type="dxa" w:w="3120"/>
-            <w:shd w:fill="FFFFFF"/>
-            <w:tcMar>
-              <w:top w:w="60" w:type="dxa"/>
-              <w:bottom w:w="60" w:type="dxa"/>
-              <w:left w:w="100" w:type="dxa"/>
-              <w:right w:w="100" w:type="dxa"/>
-            </w:tcMar>
+            <w:tcW w:type="dxa" w:w="2340"/>
           </w:tcPr>
           <w:p>
             <w:r>
-              <w:t>Error Codes</w:t>
+              <w:t>Weak Authentication</w:t>
             </w:r>
           </w:p>
         </w:tc>
         <w:tc>
           <w:tcPr>
-            <w:tcW w:type="dxa" w:w="3120"/>
-            <w:shd w:fill="FFFFFF"/>
-            <w:tcMar>
-              <w:top w:w="60" w:type="dxa"/>
-              <w:bottom w:w="60" w:type="dxa"/>
-              <w:left w:w="100" w:type="dxa"/>
-              <w:right w:w="100" w:type="dxa"/>
-            </w:tcMar>
+            <w:tcW w:type="dxa" w:w="2340"/>
           </w:tcPr>
           <w:p>
             <w:r>
-              <w:t>Standard HTTP codes (200, 201, 400, 401, 404, 500)</w:t>
+              <w:t>MEDIUM (6.5)</w:t>
             </w:r>
           </w:p>
         </w:tc>
         <w:tc>
           <w:tcPr>
-            <w:tcW w:type="dxa" w:w="3120"/>
-            <w:shd w:fill="FFFFFF"/>
-            <w:tcMar>
-              <w:top w:w="60" w:type="dxa"/>
-              <w:bottom w:w="60" w:type="dxa"/>
-              <w:left w:w="100" w:type="dxa"/>
-              <w:right w:w="100" w:type="dxa"/>
-            </w:tcMar>
+            <w:tcW w:type="dxa" w:w="2340"/>
           </w:tcPr>
           <w:p>
             <w:r>
-              <w:t>Typically returns 200 OK with errors in JSON body</w:t>
+              <w:t>Token tampering or missing expiration.</w:t>
+            </w:r>
+          </w:p>
+        </w:tc>
+        <w:tc>
+          <w:tcPr>
+            <w:tcW w:type="dxa" w:w="2340"/>
+          </w:tcPr>
+          <w:p>
+            <w:r>
+              <w:t>HMAC-SHA256 signature verification with 7d expiration.</w:t>
             </w:r>
           </w:p>
         </w:tc>
@@ -930,178 +435,41 @@
       <w:tr>
         <w:tc>
           <w:tcPr>
-            <w:tcW w:type="dxa" w:w="3120"/>
-            <w:shd w:fill="F8FAFC"/>
-            <w:tcMar>
-              <w:top w:w="60" w:type="dxa"/>
-              <w:bottom w:w="60" w:type="dxa"/>
-              <w:left w:w="100" w:type="dxa"/>
-              <w:right w:w="100" w:type="dxa"/>
-            </w:tcMar>
+            <w:tcW w:type="dxa" w:w="2340"/>
           </w:tcPr>
           <w:p>
             <w:r>
-              <w:t>Tooling &amp; Setup</w:t>
+              <w:t>Inadequate Input Validation</w:t>
             </w:r>
           </w:p>
         </w:tc>
         <w:tc>
           <w:tcPr>
-            <w:tcW w:type="dxa" w:w="3120"/>
-            <w:shd w:fill="F8FAFC"/>
-            <w:tcMar>
-              <w:top w:w="60" w:type="dxa"/>
-              <w:bottom w:w="60" w:type="dxa"/>
-              <w:left w:w="100" w:type="dxa"/>
-              <w:right w:w="100" w:type="dxa"/>
-            </w:tcMar>
+            <w:tcW w:type="dxa" w:w="2340"/>
           </w:tcPr>
           <w:p>
             <w:r>
-              <w:t>Minimal dependencies, universal curl/Postman testing</w:t>
+              <w:t>MEDIUM (6.1)</w:t>
             </w:r>
           </w:p>
         </w:tc>
         <w:tc>
           <w:tcPr>
-            <w:tcW w:type="dxa" w:w="3120"/>
-            <w:shd w:fill="F8FAFC"/>
-            <w:tcMar>
-              <w:top w:w="60" w:type="dxa"/>
-              <w:bottom w:w="60" w:type="dxa"/>
-              <w:left w:w="100" w:type="dxa"/>
-              <w:right w:w="100" w:type="dxa"/>
-            </w:tcMar>
+            <w:tcW w:type="dxa" w:w="2340"/>
           </w:tcPr>
           <w:p>
             <w:r>
-              <w:t>Requires SDL schemas, type resolvers, client libraries</w:t>
-            </w:r>
-          </w:p>
-        </w:tc>
-      </w:tr>
-    </w:tbl>
-    <w:p/>
-    <w:tbl>
-      <w:tblPr>
-        <w:tblW w:type="auto" w:w="0"/>
-        <w:jc w:val="center"/>
-        <w:tblLook w:firstColumn="1" w:firstRow="1" w:lastColumn="0" w:lastRow="0" w:noHBand="0" w:noVBand="1" w:val="04A0"/>
-      </w:tblPr>
-      <w:tblGrid>
-        <w:gridCol w:w="9360"/>
-      </w:tblGrid>
-      <w:tr>
-        <w:tc>
-          <w:tcPr>
-            <w:tcW w:type="dxa" w:w="9360"/>
-            <w:shd w:fill="F0F9FF"/>
-            <w:tcMar>
-              <w:top w:w="140" w:type="dxa"/>
-              <w:bottom w:w="140" w:type="dxa"/>
-              <w:left w:w="200" w:type="dxa"/>
-              <w:right w:w="200" w:type="dxa"/>
-            </w:tcMar>
-            <w:tcBorders>
-              <w:left w:val="single" w:sz="24" w:space="0" w:color="00b4d8"/>
-              <w:top w:val="none"/>
-              <w:right w:val="none"/>
-              <w:bottom w:val="none"/>
-            </w:tcBorders>
-          </w:tcPr>
-          <w:p>
-            <w:pPr>
-              <w:spacing w:before="40" w:after="80"/>
-            </w:pPr>
-            <w:r>
-              <w:rPr>
-                <w:b/>
-                <w:color w:val="0F172A"/>
-                <w:sz w:val="21"/>
-              </w:rPr>
-              <w:t>★ Justified Conclusion for Crackly (REST Chosen)</w:t>
-              <w:br/>
-            </w:r>
-            <w:r>
-              <w:rPr>
-                <w:color w:val="334155"/>
-                <w:sz w:val="19"/>
-              </w:rPr>
-              <w:t>REST API was selected because Crackly serves distinct resource collections (opportunities, users, health) with uniform structures. REST allows native URL-based query parameter filtering (?category=Hackathon&amp;search=React), granular rate limiting per route, standard HTTP status codes, and seamless client-side offline caching.</w:t>
-            </w:r>
-          </w:p>
-        </w:tc>
-      </w:tr>
-    </w:tbl>
-    <w:p/>
-    <w:p>
-      <w:pPr>
-        <w:pStyle w:val="Heading2"/>
-        <w:spacing w:before="280" w:after="120"/>
-      </w:pPr>
-      <w:r>
-        <w:rPr>
-          <w:b/>
-          <w:color w:val="008CB4"/>
-          <w:sz w:val="28"/>
-        </w:rPr>
-        <w:t>2.2 MongoDB vs. MySQL</w:t>
-      </w:r>
-    </w:p>
-    <w:tbl>
-      <w:tblPr>
-        <w:tblW w:type="auto" w:w="0"/>
-        <w:jc w:val="center"/>
-        <w:tblLook w:firstColumn="1" w:firstRow="1" w:lastColumn="0" w:lastRow="0" w:noHBand="0" w:noVBand="1" w:val="04A0"/>
-      </w:tblPr>
-      <w:tblGrid>
-        <w:gridCol w:w="3120"/>
-        <w:gridCol w:w="3120"/>
-        <w:gridCol w:w="3120"/>
-      </w:tblGrid>
-      <w:tr>
-        <w:tc>
-          <w:tcPr>
-            <w:tcW w:type="dxa" w:w="3120"/>
-            <w:shd w:fill="0B1426"/>
-          </w:tcPr>
-          <w:p>
-            <w:r>
-              <w:rPr>
-                <w:b/>
-                <w:color w:val="FFFFFF"/>
-              </w:rPr>
-              <w:t>Criterion</w:t>
+              <w:t>Mass assignment of admin privileges or bad scores.</w:t>
             </w:r>
           </w:p>
         </w:tc>
         <w:tc>
           <w:tcPr>
-            <w:tcW w:type="dxa" w:w="3120"/>
-            <w:shd w:fill="0B1426"/>
+            <w:tcW w:type="dxa" w:w="2340"/>
           </w:tcPr>
           <w:p>
             <w:r>
-              <w:rPr>
-                <w:b/>
-                <w:color w:val="FFFFFF"/>
-              </w:rPr>
-              <w:t>MongoDB (Mongoose ODM)</w:t>
-            </w:r>
-          </w:p>
-        </w:tc>
-        <w:tc>
-          <w:tcPr>
-            <w:tcW w:type="dxa" w:w="3120"/>
-            <w:shd w:fill="0B1426"/>
-          </w:tcPr>
-          <w:p>
-            <w:r>
-              <w:rPr>
-                <w:b/>
-                <w:color w:val="FFFFFF"/>
-              </w:rPr>
-              <w:t>MySQL (Relational RDBMS)</w:t>
+              <w:t>Joi middleware with stripUnknown: true discards unmapped fields.</w:t>
             </w:r>
           </w:p>
         </w:tc>
@@ -1109,2790 +477,106 @@
       <w:tr>
         <w:tc>
           <w:tcPr>
-            <w:tcW w:type="dxa" w:w="3120"/>
-            <w:shd w:fill="F8FAFC"/>
-            <w:tcMar>
-              <w:top w:w="60" w:type="dxa"/>
-              <w:bottom w:w="60" w:type="dxa"/>
-              <w:left w:w="100" w:type="dxa"/>
-              <w:right w:w="100" w:type="dxa"/>
-            </w:tcMar>
+            <w:tcW w:type="dxa" w:w="2340"/>
           </w:tcPr>
           <w:p>
             <w:r>
-              <w:t>Data Model</w:t>
+              <w:t>Clickjacking &amp; DoS</w:t>
             </w:r>
           </w:p>
         </w:tc>
         <w:tc>
           <w:tcPr>
-            <w:tcW w:type="dxa" w:w="3120"/>
-            <w:shd w:fill="F8FAFC"/>
-            <w:tcMar>
-              <w:top w:w="60" w:type="dxa"/>
-              <w:bottom w:w="60" w:type="dxa"/>
-              <w:left w:w="100" w:type="dxa"/>
-              <w:right w:w="100" w:type="dxa"/>
-            </w:tcMar>
+            <w:tcW w:type="dxa" w:w="2340"/>
           </w:tcPr>
           <w:p>
             <w:r>
-              <w:t>Hierarchical BSON documents (nested subdocuments)</w:t>
+              <w:t>MEDIUM (5.4)</w:t>
             </w:r>
           </w:p>
         </w:tc>
         <w:tc>
           <w:tcPr>
-            <w:tcW w:type="dxa" w:w="3120"/>
-            <w:shd w:fill="F8FAFC"/>
-            <w:tcMar>
-              <w:top w:w="60" w:type="dxa"/>
-              <w:bottom w:w="60" w:type="dxa"/>
-              <w:left w:w="100" w:type="dxa"/>
-              <w:right w:w="100" w:type="dxa"/>
-            </w:tcMar>
+            <w:tcW w:type="dxa" w:w="2340"/>
           </w:tcPr>
           <w:p>
             <w:r>
-              <w:t>Tabular rows and columns with foreign key relations</w:t>
-            </w:r>
-          </w:p>
-        </w:tc>
-      </w:tr>
-      <w:tr>
-        <w:tc>
-          <w:tcPr>
-            <w:tcW w:type="dxa" w:w="3120"/>
-            <w:shd w:fill="FFFFFF"/>
-            <w:tcMar>
-              <w:top w:w="60" w:type="dxa"/>
-              <w:bottom w:w="60" w:type="dxa"/>
-              <w:left w:w="100" w:type="dxa"/>
-              <w:right w:w="100" w:type="dxa"/>
-            </w:tcMar>
-          </w:tcPr>
-          <w:p>
-            <w:r>
-              <w:t>Schema Flexibility</w:t>
+              <w:t>Transparent iframe framing; flood requests.</w:t>
             </w:r>
           </w:p>
         </w:tc>
         <w:tc>
           <w:tcPr>
-            <w:tcW w:type="dxa" w:w="3120"/>
-            <w:shd w:fill="FFFFFF"/>
-            <w:tcMar>
-              <w:top w:w="60" w:type="dxa"/>
-              <w:bottom w:w="60" w:type="dxa"/>
-              <w:left w:w="100" w:type="dxa"/>
-              <w:right w:w="100" w:type="dxa"/>
-            </w:tcMar>
+            <w:tcW w:type="dxa" w:w="2340"/>
           </w:tcPr>
           <w:p>
             <w:r>
-              <w:t>Dynamic / schema-less (enforced via Mongoose &amp; Joi)</w:t>
-            </w:r>
-          </w:p>
-        </w:tc>
-        <w:tc>
-          <w:tcPr>
-            <w:tcW w:type="dxa" w:w="3120"/>
-            <w:shd w:fill="FFFFFF"/>
-            <w:tcMar>
-              <w:top w:w="60" w:type="dxa"/>
-              <w:bottom w:w="60" w:type="dxa"/>
-              <w:left w:w="100" w:type="dxa"/>
-              <w:right w:w="100" w:type="dxa"/>
-            </w:tcMar>
-          </w:tcPr>
-          <w:p>
-            <w:r>
-              <w:t>Rigid schema requiring migrations (ALTER TABLE)</w:t>
-            </w:r>
-          </w:p>
-        </w:tc>
-      </w:tr>
-      <w:tr>
-        <w:tc>
-          <w:tcPr>
-            <w:tcW w:type="dxa" w:w="3120"/>
-            <w:shd w:fill="F8FAFC"/>
-            <w:tcMar>
-              <w:top w:w="60" w:type="dxa"/>
-              <w:bottom w:w="60" w:type="dxa"/>
-              <w:left w:w="100" w:type="dxa"/>
-              <w:right w:w="100" w:type="dxa"/>
-            </w:tcMar>
-          </w:tcPr>
-          <w:p>
-            <w:r>
-              <w:t>Nested Objects</w:t>
-            </w:r>
-          </w:p>
-        </w:tc>
-        <w:tc>
-          <w:tcPr>
-            <w:tcW w:type="dxa" w:w="3120"/>
-            <w:shd w:fill="F8FAFC"/>
-            <w:tcMar>
-              <w:top w:w="60" w:type="dxa"/>
-              <w:bottom w:w="60" w:type="dxa"/>
-              <w:left w:w="100" w:type="dxa"/>
-              <w:right w:w="100" w:type="dxa"/>
-            </w:tcMar>
-          </w:tcPr>
-          <w:p>
-            <w:r>
-              <w:t>Native embedded arrays (roadmap weeks, Q&amp;A items)</w:t>
-            </w:r>
-          </w:p>
-        </w:tc>
-        <w:tc>
-          <w:tcPr>
-            <w:tcW w:type="dxa" w:w="3120"/>
-            <w:shd w:fill="F8FAFC"/>
-            <w:tcMar>
-              <w:top w:w="60" w:type="dxa"/>
-              <w:bottom w:w="60" w:type="dxa"/>
-              <w:left w:w="100" w:type="dxa"/>
-              <w:right w:w="100" w:type="dxa"/>
-            </w:tcMar>
-          </w:tcPr>
-          <w:p>
-            <w:r>
-              <w:t>Requires multiple normalized tables with JOINs</w:t>
-            </w:r>
-          </w:p>
-        </w:tc>
-      </w:tr>
-      <w:tr>
-        <w:tc>
-          <w:tcPr>
-            <w:tcW w:type="dxa" w:w="3120"/>
-            <w:shd w:fill="FFFFFF"/>
-            <w:tcMar>
-              <w:top w:w="60" w:type="dxa"/>
-              <w:bottom w:w="60" w:type="dxa"/>
-              <w:left w:w="100" w:type="dxa"/>
-              <w:right w:w="100" w:type="dxa"/>
-            </w:tcMar>
-          </w:tcPr>
-          <w:p>
-            <w:r>
-              <w:t>Search Queries</w:t>
-            </w:r>
-          </w:p>
-        </w:tc>
-        <w:tc>
-          <w:tcPr>
-            <w:tcW w:type="dxa" w:w="3120"/>
-            <w:shd w:fill="FFFFFF"/>
-            <w:tcMar>
-              <w:top w:w="60" w:type="dxa"/>
-              <w:bottom w:w="60" w:type="dxa"/>
-              <w:left w:w="100" w:type="dxa"/>
-              <w:right w:w="100" w:type="dxa"/>
-            </w:tcMar>
-          </w:tcPr>
-          <w:p>
-            <w:r>
-              <w:t>Built-in compound text indexes and regex matches</w:t>
-            </w:r>
-          </w:p>
-        </w:tc>
-        <w:tc>
-          <w:tcPr>
-            <w:tcW w:type="dxa" w:w="3120"/>
-            <w:shd w:fill="FFFFFF"/>
-            <w:tcMar>
-              <w:top w:w="60" w:type="dxa"/>
-              <w:bottom w:w="60" w:type="dxa"/>
-              <w:left w:w="100" w:type="dxa"/>
-              <w:right w:w="100" w:type="dxa"/>
-            </w:tcMar>
-          </w:tcPr>
-          <w:p>
-            <w:r>
-              <w:t>Full-text search or external search engines (Elastic)</w:t>
-            </w:r>
-          </w:p>
-        </w:tc>
-      </w:tr>
-      <w:tr>
-        <w:tc>
-          <w:tcPr>
-            <w:tcW w:type="dxa" w:w="3120"/>
-            <w:shd w:fill="F8FAFC"/>
-            <w:tcMar>
-              <w:top w:w="60" w:type="dxa"/>
-              <w:bottom w:w="60" w:type="dxa"/>
-              <w:left w:w="100" w:type="dxa"/>
-              <w:right w:w="100" w:type="dxa"/>
-            </w:tcMar>
-          </w:tcPr>
-          <w:p>
-            <w:r>
-              <w:t>Scalability</w:t>
-            </w:r>
-          </w:p>
-        </w:tc>
-        <w:tc>
-          <w:tcPr>
-            <w:tcW w:type="dxa" w:w="3120"/>
-            <w:shd w:fill="F8FAFC"/>
-            <w:tcMar>
-              <w:top w:w="60" w:type="dxa"/>
-              <w:bottom w:w="60" w:type="dxa"/>
-              <w:left w:w="100" w:type="dxa"/>
-              <w:right w:w="100" w:type="dxa"/>
-            </w:tcMar>
-          </w:tcPr>
-          <w:p>
-            <w:r>
-              <w:t>Horizontal scaling via native sharding &amp; replica sets</w:t>
-            </w:r>
-          </w:p>
-        </w:tc>
-        <w:tc>
-          <w:tcPr>
-            <w:tcW w:type="dxa" w:w="3120"/>
-            <w:shd w:fill="F8FAFC"/>
-            <w:tcMar>
-              <w:top w:w="60" w:type="dxa"/>
-              <w:bottom w:w="60" w:type="dxa"/>
-              <w:left w:w="100" w:type="dxa"/>
-              <w:right w:w="100" w:type="dxa"/>
-            </w:tcMar>
-          </w:tcPr>
-          <w:p>
-            <w:r>
-              <w:t>Primarily vertical scaling or read replication</w:t>
+              <w:t>Helmet X-Frame-Options: DENY; express-rate-limit (200 req / 15 min).</w:t>
             </w:r>
           </w:p>
         </w:tc>
       </w:tr>
     </w:tbl>
-    <w:p/>
-    <w:tbl>
-      <w:tblPr>
-        <w:tblW w:type="auto" w:w="0"/>
-        <w:jc w:val="center"/>
-        <w:tblLook w:firstColumn="1" w:firstRow="1" w:lastColumn="0" w:lastRow="0" w:noHBand="0" w:noVBand="1" w:val="04A0"/>
-      </w:tblPr>
-      <w:tblGrid>
-        <w:gridCol w:w="9360"/>
-      </w:tblGrid>
-      <w:tr>
-        <w:tc>
-          <w:tcPr>
-            <w:tcW w:type="dxa" w:w="9360"/>
-            <w:shd w:fill="F0F9FF"/>
-            <w:tcMar>
-              <w:top w:w="140" w:type="dxa"/>
-              <w:bottom w:w="140" w:type="dxa"/>
-              <w:left w:w="200" w:type="dxa"/>
-              <w:right w:w="200" w:type="dxa"/>
-            </w:tcMar>
-            <w:tcBorders>
-              <w:left w:val="single" w:sz="24" w:space="0" w:color="00b4d8"/>
-              <w:top w:val="none"/>
-              <w:right w:val="none"/>
-              <w:bottom w:val="none"/>
-            </w:tcBorders>
-          </w:tcPr>
-          <w:p>
-            <w:pPr>
-              <w:spacing w:before="40" w:after="80"/>
-            </w:pPr>
-            <w:r>
-              <w:rPr>
-                <w:b/>
-                <w:color w:val="0F172A"/>
-                <w:sz w:val="21"/>
-              </w:rPr>
-              <w:t>★ Justified Conclusion for Crackly (MongoDB Chosen)</w:t>
-              <w:br/>
-            </w:r>
-            <w:r>
-              <w:rPr>
-                <w:color w:val="334155"/>
-                <w:sz w:val="19"/>
-              </w:rPr>
-              <w:t>Crackly's opportunities are inherently hierarchical. Each record contains a 4-week roadmap, technical modules, and sample interview Q&amp;As. In MySQL, retrieving this single opportunity requires 4 JOIN operations across 4 tables. MongoDB stores and retrieves the entire document in a single indexed read operation, maximizing performance and development speed.</w:t>
-            </w:r>
-          </w:p>
-        </w:tc>
-      </w:tr>
-    </w:tbl>
-    <w:p/>
+    <w:p>
+      <w:pPr>
+        <w:pStyle w:val="Heading1"/>
+      </w:pPr>
+      <w:r>
+        <w:t>4. Task 3: Implementation &amp; Demonstration of Security Libraries</w:t>
+      </w:r>
+    </w:p>
     <w:p>
       <w:pPr>
         <w:pStyle w:val="Heading2"/>
-        <w:spacing w:before="280" w:after="120"/>
       </w:pPr>
       <w:r>
-        <w:rPr>
-          <w:b/>
-          <w:color w:val="008CB4"/>
-          <w:sz w:val="28"/>
-        </w:rPr>
-        <w:t>2.3 React vs. Angular</w:t>
+        <w:t>4.1 Helmet.js</w:t>
       </w:r>
     </w:p>
-    <w:tbl>
-      <w:tblPr>
-        <w:tblW w:type="auto" w:w="0"/>
-        <w:jc w:val="center"/>
-        <w:tblLook w:firstColumn="1" w:firstRow="1" w:lastColumn="0" w:lastRow="0" w:noHBand="0" w:noVBand="1" w:val="04A0"/>
-      </w:tblPr>
-      <w:tblGrid>
-        <w:gridCol w:w="3120"/>
-        <w:gridCol w:w="3120"/>
-        <w:gridCol w:w="3120"/>
-      </w:tblGrid>
-      <w:tr>
-        <w:tc>
-          <w:tcPr>
-            <w:tcW w:type="dxa" w:w="3120"/>
-            <w:shd w:fill="0B1426"/>
-          </w:tcPr>
-          <w:p>
-            <w:r>
-              <w:rPr>
-                <w:b/>
-                <w:color w:val="FFFFFF"/>
-              </w:rPr>
-              <w:t>Criterion</w:t>
-            </w:r>
-          </w:p>
-        </w:tc>
-        <w:tc>
-          <w:tcPr>
-            <w:tcW w:type="dxa" w:w="3120"/>
-            <w:shd w:fill="0B1426"/>
-          </w:tcPr>
-          <w:p>
-            <w:r>
-              <w:rPr>
-                <w:b/>
-                <w:color w:val="FFFFFF"/>
-              </w:rPr>
-              <w:t>React 18 + Vite</w:t>
-            </w:r>
-          </w:p>
-        </w:tc>
-        <w:tc>
-          <w:tcPr>
-            <w:tcW w:type="dxa" w:w="3120"/>
-            <w:shd w:fill="0B1426"/>
-          </w:tcPr>
-          <w:p>
-            <w:r>
-              <w:rPr>
-                <w:b/>
-                <w:color w:val="FFFFFF"/>
-              </w:rPr>
-              <w:t>Angular (v16+)</w:t>
-            </w:r>
-          </w:p>
-        </w:tc>
-      </w:tr>
-      <w:tr>
-        <w:tc>
-          <w:tcPr>
-            <w:tcW w:type="dxa" w:w="3120"/>
-            <w:shd w:fill="F8FAFC"/>
-            <w:tcMar>
-              <w:top w:w="60" w:type="dxa"/>
-              <w:bottom w:w="60" w:type="dxa"/>
-              <w:left w:w="100" w:type="dxa"/>
-              <w:right w:w="100" w:type="dxa"/>
-            </w:tcMar>
-          </w:tcPr>
-          <w:p>
-            <w:r>
-              <w:t>Philosophy</w:t>
-            </w:r>
-          </w:p>
-        </w:tc>
-        <w:tc>
-          <w:tcPr>
-            <w:tcW w:type="dxa" w:w="3120"/>
-            <w:shd w:fill="F8FAFC"/>
-            <w:tcMar>
-              <w:top w:w="60" w:type="dxa"/>
-              <w:bottom w:w="60" w:type="dxa"/>
-              <w:left w:w="100" w:type="dxa"/>
-              <w:right w:w="100" w:type="dxa"/>
-            </w:tcMar>
-          </w:tcPr>
-          <w:p>
-            <w:r>
-              <w:t>Lightweight View library; declarative component model</w:t>
-            </w:r>
-          </w:p>
-        </w:tc>
-        <w:tc>
-          <w:tcPr>
-            <w:tcW w:type="dxa" w:w="3120"/>
-            <w:shd w:fill="F8FAFC"/>
-            <w:tcMar>
-              <w:top w:w="60" w:type="dxa"/>
-              <w:bottom w:w="60" w:type="dxa"/>
-              <w:left w:w="100" w:type="dxa"/>
-              <w:right w:w="100" w:type="dxa"/>
-            </w:tcMar>
-          </w:tcPr>
-          <w:p>
-            <w:r>
-              <w:t>Comprehensive, opinionated full-stack frontend framework</w:t>
-            </w:r>
-          </w:p>
-        </w:tc>
-      </w:tr>
-      <w:tr>
-        <w:tc>
-          <w:tcPr>
-            <w:tcW w:type="dxa" w:w="3120"/>
-            <w:shd w:fill="FFFFFF"/>
-            <w:tcMar>
-              <w:top w:w="60" w:type="dxa"/>
-              <w:bottom w:w="60" w:type="dxa"/>
-              <w:left w:w="100" w:type="dxa"/>
-              <w:right w:w="100" w:type="dxa"/>
-            </w:tcMar>
-          </w:tcPr>
-          <w:p>
-            <w:r>
-              <w:t>Compilation</w:t>
-            </w:r>
-          </w:p>
-        </w:tc>
-        <w:tc>
-          <w:tcPr>
-            <w:tcW w:type="dxa" w:w="3120"/>
-            <w:shd w:fill="FFFFFF"/>
-            <w:tcMar>
-              <w:top w:w="60" w:type="dxa"/>
-              <w:bottom w:w="60" w:type="dxa"/>
-              <w:left w:w="100" w:type="dxa"/>
-              <w:right w:w="100" w:type="dxa"/>
-            </w:tcMar>
-          </w:tcPr>
-          <w:p>
-            <w:r>
-              <w:t>Vite build tool (sub-50ms HMR, instant startup)</w:t>
-            </w:r>
-          </w:p>
-        </w:tc>
-        <w:tc>
-          <w:tcPr>
-            <w:tcW w:type="dxa" w:w="3120"/>
-            <w:shd w:fill="FFFFFF"/>
-            <w:tcMar>
-              <w:top w:w="60" w:type="dxa"/>
-              <w:bottom w:w="60" w:type="dxa"/>
-              <w:left w:w="100" w:type="dxa"/>
-              <w:right w:w="100" w:type="dxa"/>
-            </w:tcMar>
-          </w:tcPr>
-          <w:p>
-            <w:r>
-              <w:t>Angular CLI / Webpack with Ahead-of-Time (AOT) compilation</w:t>
-            </w:r>
-          </w:p>
-        </w:tc>
-      </w:tr>
-      <w:tr>
-        <w:tc>
-          <w:tcPr>
-            <w:tcW w:type="dxa" w:w="3120"/>
-            <w:shd w:fill="F8FAFC"/>
-            <w:tcMar>
-              <w:top w:w="60" w:type="dxa"/>
-              <w:bottom w:w="60" w:type="dxa"/>
-              <w:left w:w="100" w:type="dxa"/>
-              <w:right w:w="100" w:type="dxa"/>
-            </w:tcMar>
-          </w:tcPr>
-          <w:p>
-            <w:r>
-              <w:t>State Management</w:t>
-            </w:r>
-          </w:p>
-        </w:tc>
-        <w:tc>
-          <w:tcPr>
-            <w:tcW w:type="dxa" w:w="3120"/>
-            <w:shd w:fill="F8FAFC"/>
-            <w:tcMar>
-              <w:top w:w="60" w:type="dxa"/>
-              <w:bottom w:w="60" w:type="dxa"/>
-              <w:left w:w="100" w:type="dxa"/>
-              <w:right w:w="100" w:type="dxa"/>
-            </w:tcMar>
-          </w:tcPr>
-          <w:p>
-            <w:r>
-              <w:t>React Hooks (useState, useEffect, useCallback)</w:t>
-            </w:r>
-          </w:p>
-        </w:tc>
-        <w:tc>
-          <w:tcPr>
-            <w:tcW w:type="dxa" w:w="3120"/>
-            <w:shd w:fill="F8FAFC"/>
-            <w:tcMar>
-              <w:top w:w="60" w:type="dxa"/>
-              <w:bottom w:w="60" w:type="dxa"/>
-              <w:left w:w="100" w:type="dxa"/>
-              <w:right w:w="100" w:type="dxa"/>
-            </w:tcMar>
-          </w:tcPr>
-          <w:p>
-            <w:r>
-              <w:t>RxJS Observables, Signals, and NgRx</w:t>
-            </w:r>
-          </w:p>
-        </w:tc>
-      </w:tr>
-      <w:tr>
-        <w:tc>
-          <w:tcPr>
-            <w:tcW w:type="dxa" w:w="3120"/>
-            <w:shd w:fill="FFFFFF"/>
-            <w:tcMar>
-              <w:top w:w="60" w:type="dxa"/>
-              <w:bottom w:w="60" w:type="dxa"/>
-              <w:left w:w="100" w:type="dxa"/>
-              <w:right w:w="100" w:type="dxa"/>
-            </w:tcMar>
-          </w:tcPr>
-          <w:p>
-            <w:r>
-              <w:t>Component Size</w:t>
-            </w:r>
-          </w:p>
-        </w:tc>
-        <w:tc>
-          <w:tcPr>
-            <w:tcW w:type="dxa" w:w="3120"/>
-            <w:shd w:fill="FFFFFF"/>
-            <w:tcMar>
-              <w:top w:w="60" w:type="dxa"/>
-              <w:bottom w:w="60" w:type="dxa"/>
-              <w:left w:w="100" w:type="dxa"/>
-              <w:right w:w="100" w:type="dxa"/>
-            </w:tcMar>
-          </w:tcPr>
-          <w:p>
-            <w:r>
-              <w:t>Minimal runtime overhead (~40KB gzip)</w:t>
-            </w:r>
-          </w:p>
-        </w:tc>
-        <w:tc>
-          <w:tcPr>
-            <w:tcW w:type="dxa" w:w="3120"/>
-            <w:shd w:fill="FFFFFF"/>
-            <w:tcMar>
-              <w:top w:w="60" w:type="dxa"/>
-              <w:bottom w:w="60" w:type="dxa"/>
-              <w:left w:w="100" w:type="dxa"/>
-              <w:right w:w="100" w:type="dxa"/>
-            </w:tcMar>
-          </w:tcPr>
-          <w:p>
-            <w:r>
-              <w:t>Heavier initial bundle size (~120KB+ gzip)</w:t>
-            </w:r>
-          </w:p>
-        </w:tc>
-      </w:tr>
-    </w:tbl>
-    <w:p/>
-    <w:tbl>
-      <w:tblPr>
-        <w:tblW w:type="auto" w:w="0"/>
-        <w:jc w:val="center"/>
-        <w:tblLook w:firstColumn="1" w:firstRow="1" w:lastColumn="0" w:lastRow="0" w:noHBand="0" w:noVBand="1" w:val="04A0"/>
-      </w:tblPr>
-      <w:tblGrid>
-        <w:gridCol w:w="9360"/>
-      </w:tblGrid>
-      <w:tr>
-        <w:tc>
-          <w:tcPr>
-            <w:tcW w:type="dxa" w:w="9360"/>
-            <w:shd w:fill="F0F9FF"/>
-            <w:tcMar>
-              <w:top w:w="140" w:type="dxa"/>
-              <w:bottom w:w="140" w:type="dxa"/>
-              <w:left w:w="200" w:type="dxa"/>
-              <w:right w:w="200" w:type="dxa"/>
-            </w:tcMar>
-            <w:tcBorders>
-              <w:left w:val="single" w:sz="24" w:space="0" w:color="00b4d8"/>
-              <w:top w:val="none"/>
-              <w:right w:val="none"/>
-              <w:bottom w:val="none"/>
-            </w:tcBorders>
-          </w:tcPr>
-          <w:p>
-            <w:pPr>
-              <w:spacing w:before="40" w:after="80"/>
-            </w:pPr>
-            <w:r>
-              <w:rPr>
-                <w:b/>
-                <w:color w:val="0F172A"/>
-                <w:sz w:val="21"/>
-              </w:rPr>
-              <w:t>★ Justified Conclusion for Crackly (React Chosen)</w:t>
-              <w:br/>
-            </w:r>
-            <w:r>
-              <w:rPr>
-                <w:color w:val="334155"/>
-                <w:sz w:val="19"/>
-              </w:rPr>
-              <w:t>React's functional component model and hook ecosystem enabled rapid development of custom animated components: the isometric SVG workstation illustration, the debounced search bar, and the slide-over Prep Drawer modal. Vite enables production builds in under 5 seconds.</w:t>
-            </w:r>
-          </w:p>
-        </w:tc>
-      </w:tr>
-    </w:tbl>
-    <w:p/>
+    <w:p>
+      <w:r>
+        <w:t>Configured in server/server.js to enforce HTTP response headers: X-Frame-Options: DENY (clickjacking protection), X-Content-Type-Options: nosniff (MIME-sniffing prevention), Content-Security-Policy (XSS mitigation), Strict-Transport-Security (HTTPS enforcement), and hides X-Powered-By.</w:t>
+      </w:r>
+    </w:p>
     <w:p>
       <w:pPr>
         <w:pStyle w:val="Heading2"/>
-        <w:spacing w:before="280" w:after="120"/>
       </w:pPr>
       <w:r>
-        <w:rPr>
-          <w:b/>
-          <w:color w:val="008CB4"/>
-          <w:sz w:val="28"/>
-        </w:rPr>
-        <w:t>2.4 JWT-Based vs. Session-Based Authentication</w:t>
+        <w:t>4.2 bcrypt</w:t>
       </w:r>
     </w:p>
-    <w:tbl>
-      <w:tblPr>
-        <w:tblW w:type="auto" w:w="0"/>
-        <w:jc w:val="center"/>
-        <w:tblLook w:firstColumn="1" w:firstRow="1" w:lastColumn="0" w:lastRow="0" w:noHBand="0" w:noVBand="1" w:val="04A0"/>
-      </w:tblPr>
-      <w:tblGrid>
-        <w:gridCol w:w="3120"/>
-        <w:gridCol w:w="3120"/>
-        <w:gridCol w:w="3120"/>
-      </w:tblGrid>
-      <w:tr>
-        <w:tc>
-          <w:tcPr>
-            <w:tcW w:type="dxa" w:w="3120"/>
-            <w:shd w:fill="0B1426"/>
-          </w:tcPr>
-          <w:p>
-            <w:r>
-              <w:rPr>
-                <w:b/>
-                <w:color w:val="FFFFFF"/>
-              </w:rPr>
-              <w:t>Criterion</w:t>
-            </w:r>
-          </w:p>
-        </w:tc>
-        <w:tc>
-          <w:tcPr>
-            <w:tcW w:type="dxa" w:w="3120"/>
-            <w:shd w:fill="0B1426"/>
-          </w:tcPr>
-          <w:p>
-            <w:r>
-              <w:rPr>
-                <w:b/>
-                <w:color w:val="FFFFFF"/>
-              </w:rPr>
-              <w:t>JWT-Based (Stateless)</w:t>
-            </w:r>
-          </w:p>
-        </w:tc>
-        <w:tc>
-          <w:tcPr>
-            <w:tcW w:type="dxa" w:w="3120"/>
-            <w:shd w:fill="0B1426"/>
-          </w:tcPr>
-          <w:p>
-            <w:r>
-              <w:rPr>
-                <w:b/>
-                <w:color w:val="FFFFFF"/>
-              </w:rPr>
-              <w:t>Session-Based (Stateful Cookies)</w:t>
-            </w:r>
-          </w:p>
-        </w:tc>
-      </w:tr>
-      <w:tr>
-        <w:tc>
-          <w:tcPr>
-            <w:tcW w:type="dxa" w:w="3120"/>
-            <w:shd w:fill="F8FAFC"/>
-            <w:tcMar>
-              <w:top w:w="60" w:type="dxa"/>
-              <w:bottom w:w="60" w:type="dxa"/>
-              <w:left w:w="100" w:type="dxa"/>
-              <w:right w:w="100" w:type="dxa"/>
-            </w:tcMar>
-          </w:tcPr>
-          <w:p>
-            <w:r>
-              <w:t>Server Memory</w:t>
-            </w:r>
-          </w:p>
-        </w:tc>
-        <w:tc>
-          <w:tcPr>
-            <w:tcW w:type="dxa" w:w="3120"/>
-            <w:shd w:fill="F8FAFC"/>
-            <w:tcMar>
-              <w:top w:w="60" w:type="dxa"/>
-              <w:bottom w:w="60" w:type="dxa"/>
-              <w:left w:w="100" w:type="dxa"/>
-              <w:right w:w="100" w:type="dxa"/>
-            </w:tcMar>
-          </w:tcPr>
-          <w:p>
-            <w:r>
-              <w:t>Stateless: Server stores zero session state</w:t>
-            </w:r>
-          </w:p>
-        </w:tc>
-        <w:tc>
-          <w:tcPr>
-            <w:tcW w:type="dxa" w:w="3120"/>
-            <w:shd w:fill="F8FAFC"/>
-            <w:tcMar>
-              <w:top w:w="60" w:type="dxa"/>
-              <w:bottom w:w="60" w:type="dxa"/>
-              <w:left w:w="100" w:type="dxa"/>
-              <w:right w:w="100" w:type="dxa"/>
-            </w:tcMar>
-          </w:tcPr>
-          <w:p>
-            <w:r>
-              <w:t>Stateful: Server stores session in memory or Redis</w:t>
-            </w:r>
-          </w:p>
-        </w:tc>
-      </w:tr>
-      <w:tr>
-        <w:tc>
-          <w:tcPr>
-            <w:tcW w:type="dxa" w:w="3120"/>
-            <w:shd w:fill="FFFFFF"/>
-            <w:tcMar>
-              <w:top w:w="60" w:type="dxa"/>
-              <w:bottom w:w="60" w:type="dxa"/>
-              <w:left w:w="100" w:type="dxa"/>
-              <w:right w:w="100" w:type="dxa"/>
-            </w:tcMar>
-          </w:tcPr>
-          <w:p>
-            <w:r>
-              <w:t>Horizontal Scale</w:t>
-            </w:r>
-          </w:p>
-        </w:tc>
-        <w:tc>
-          <w:tcPr>
-            <w:tcW w:type="dxa" w:w="3120"/>
-            <w:shd w:fill="FFFFFF"/>
-            <w:tcMar>
-              <w:top w:w="60" w:type="dxa"/>
-              <w:bottom w:w="60" w:type="dxa"/>
-              <w:left w:w="100" w:type="dxa"/>
-              <w:right w:w="100" w:type="dxa"/>
-            </w:tcMar>
-          </w:tcPr>
-          <w:p>
-            <w:r>
-              <w:t>Trivial: Any cluster node verifies the token signature</w:t>
-            </w:r>
-          </w:p>
-        </w:tc>
-        <w:tc>
-          <w:tcPr>
-            <w:tcW w:type="dxa" w:w="3120"/>
-            <w:shd w:fill="FFFFFF"/>
-            <w:tcMar>
-              <w:top w:w="60" w:type="dxa"/>
-              <w:bottom w:w="60" w:type="dxa"/>
-              <w:left w:w="100" w:type="dxa"/>
-              <w:right w:w="100" w:type="dxa"/>
-            </w:tcMar>
-          </w:tcPr>
-          <w:p>
-            <w:r>
-              <w:t>Requires sticky sessions or distributed Redis store</w:t>
-            </w:r>
-          </w:p>
-        </w:tc>
-      </w:tr>
-      <w:tr>
-        <w:tc>
-          <w:tcPr>
-            <w:tcW w:type="dxa" w:w="3120"/>
-            <w:shd w:fill="F8FAFC"/>
-            <w:tcMar>
-              <w:top w:w="60" w:type="dxa"/>
-              <w:bottom w:w="60" w:type="dxa"/>
-              <w:left w:w="100" w:type="dxa"/>
-              <w:right w:w="100" w:type="dxa"/>
-            </w:tcMar>
-          </w:tcPr>
-          <w:p>
-            <w:r>
-              <w:t>Cross-Origin</w:t>
-            </w:r>
-          </w:p>
-        </w:tc>
-        <w:tc>
-          <w:tcPr>
-            <w:tcW w:type="dxa" w:w="3120"/>
-            <w:shd w:fill="F8FAFC"/>
-            <w:tcMar>
-              <w:top w:w="60" w:type="dxa"/>
-              <w:bottom w:w="60" w:type="dxa"/>
-              <w:left w:w="100" w:type="dxa"/>
-              <w:right w:w="100" w:type="dxa"/>
-            </w:tcMar>
-          </w:tcPr>
-          <w:p>
-            <w:r>
-              <w:t>Native: Sent via Authorization Bearer header</w:t>
-            </w:r>
-          </w:p>
-        </w:tc>
-        <w:tc>
-          <w:tcPr>
-            <w:tcW w:type="dxa" w:w="3120"/>
-            <w:shd w:fill="F8FAFC"/>
-            <w:tcMar>
-              <w:top w:w="60" w:type="dxa"/>
-              <w:bottom w:w="60" w:type="dxa"/>
-              <w:left w:w="100" w:type="dxa"/>
-              <w:right w:w="100" w:type="dxa"/>
-            </w:tcMar>
-          </w:tcPr>
-          <w:p>
-            <w:r>
-              <w:t>Requires complex CORS cookie credentials handling</w:t>
-            </w:r>
-          </w:p>
-        </w:tc>
-      </w:tr>
-      <w:tr>
-        <w:tc>
-          <w:tcPr>
-            <w:tcW w:type="dxa" w:w="3120"/>
-            <w:shd w:fill="FFFFFF"/>
-            <w:tcMar>
-              <w:top w:w="60" w:type="dxa"/>
-              <w:bottom w:w="60" w:type="dxa"/>
-              <w:left w:w="100" w:type="dxa"/>
-              <w:right w:w="100" w:type="dxa"/>
-            </w:tcMar>
-          </w:tcPr>
-          <w:p>
-            <w:r>
-              <w:t>Revocation</w:t>
-            </w:r>
-          </w:p>
-        </w:tc>
-        <w:tc>
-          <w:tcPr>
-            <w:tcW w:type="dxa" w:w="3120"/>
-            <w:shd w:fill="FFFFFF"/>
-            <w:tcMar>
-              <w:top w:w="60" w:type="dxa"/>
-              <w:bottom w:w="60" w:type="dxa"/>
-              <w:left w:w="100" w:type="dxa"/>
-              <w:right w:w="100" w:type="dxa"/>
-            </w:tcMar>
-          </w:tcPr>
-          <w:p>
-            <w:r>
-              <w:t>Requires token expiry (TTL) or token blacklists</w:t>
-            </w:r>
-          </w:p>
-        </w:tc>
-        <w:tc>
-          <w:tcPr>
-            <w:tcW w:type="dxa" w:w="3120"/>
-            <w:shd w:fill="FFFFFF"/>
-            <w:tcMar>
-              <w:top w:w="60" w:type="dxa"/>
-              <w:bottom w:w="60" w:type="dxa"/>
-              <w:left w:w="100" w:type="dxa"/>
-              <w:right w:w="100" w:type="dxa"/>
-            </w:tcMar>
-          </w:tcPr>
-          <w:p>
-            <w:r>
-              <w:t>Instant: Deleting session from store logs user out</w:t>
-            </w:r>
-          </w:p>
-        </w:tc>
-      </w:tr>
-    </w:tbl>
-    <w:p/>
-    <w:tbl>
-      <w:tblPr>
-        <w:tblW w:type="auto" w:w="0"/>
-        <w:jc w:val="center"/>
-        <w:tblLook w:firstColumn="1" w:firstRow="1" w:lastColumn="0" w:lastRow="0" w:noHBand="0" w:noVBand="1" w:val="04A0"/>
-      </w:tblPr>
-      <w:tblGrid>
-        <w:gridCol w:w="9360"/>
-      </w:tblGrid>
-      <w:tr>
-        <w:tc>
-          <w:tcPr>
-            <w:tcW w:type="dxa" w:w="9360"/>
-            <w:shd w:fill="F0F9FF"/>
-            <w:tcMar>
-              <w:top w:w="140" w:type="dxa"/>
-              <w:bottom w:w="140" w:type="dxa"/>
-              <w:left w:w="200" w:type="dxa"/>
-              <w:right w:w="200" w:type="dxa"/>
-            </w:tcMar>
-            <w:tcBorders>
-              <w:left w:val="single" w:sz="24" w:space="0" w:color="00b4d8"/>
-              <w:top w:val="none"/>
-              <w:right w:val="none"/>
-              <w:bottom w:val="none"/>
-            </w:tcBorders>
-          </w:tcPr>
-          <w:p>
-            <w:pPr>
-              <w:spacing w:before="40" w:after="80"/>
-            </w:pPr>
-            <w:r>
-              <w:rPr>
-                <w:b/>
-                <w:color w:val="0F172A"/>
-                <w:sz w:val="21"/>
-              </w:rPr>
-              <w:t>★ Justified Conclusion for Crackly (JWT Chosen)</w:t>
-              <w:br/>
-            </w:r>
-            <w:r>
-              <w:rPr>
-                <w:color w:val="334155"/>
-                <w:sz w:val="19"/>
-              </w:rPr>
-              <w:t>Because Crackly's React frontend (port 5173) is decoupled from the Express API (port 5000), JWT allows straightforward cross-origin bearer token authorization without session store dependencies or third-party cookie blocking.</w:t>
-            </w:r>
-          </w:p>
-        </w:tc>
-      </w:tr>
-    </w:tbl>
-    <w:p/>
     <w:p>
       <w:r>
-        <w:br w:type="page"/>
+        <w:t>Configured in server/models/User.js via a pre('save') hook using bcrypt.genSalt(10) and bcrypt.hash(). Generates unique cryptographic salts per user and verifies credentials during login using constant-time bcrypt.compare(), neutralizing Rainbow Table attacks.</w:t>
+      </w:r>
+    </w:p>
+    <w:p>
+      <w:pPr>
+        <w:pStyle w:val="Heading2"/>
+      </w:pPr>
+      <w:r>
+        <w:t>4.3 Joi</w:t>
+      </w:r>
+    </w:p>
+    <w:p>
+      <w:r>
+        <w:t>Configured in server/validations/presentationValidation.js and server/middleware/validate.js. Enforces strict schema contracts on request bodies and queries, strips unknown attributes ({ stripUnknown: true }), validates numerical score bounds, and returns structured HTTP 400 validation error arrays.</w:t>
       </w:r>
     </w:p>
     <w:p>
       <w:pPr>
         <w:pStyle w:val="Heading1"/>
-        <w:spacing w:before="280" w:after="120"/>
       </w:pPr>
       <w:r>
-        <w:rPr>
-          <w:b/>
-          <w:color w:val="0B1426"/>
-          <w:sz w:val="36"/>
-        </w:rPr>
-        <w:t>3. Task 2: Security Audit Report</w:t>
+        <w:t>5. Conclusion &amp; Verification Summary</w:t>
       </w:r>
     </w:p>
     <w:p>
       <w:r>
-        <w:t>A rigorous security audit was performed on the Crackly application to identify potential vulnerabilities, classify risks according to industry standards (OWASP Top 10 / CVSS v3.1), and implement preventive engineering measures.</w:t>
+        <w:t>Crackly successfully satisfies all academic and practical requirements of B.Tech Semester-5 AWD. The project is lean, robust, fully documented, and ready for regular final viva-voce evaluation.</w:t>
       </w:r>
     </w:p>
-    <w:p>
-      <w:pPr>
-        <w:pStyle w:val="Heading2"/>
-        <w:spacing w:before="280" w:after="120"/>
-      </w:pPr>
-      <w:r>
-        <w:rPr>
-          <w:b/>
-          <w:color w:val="008CB4"/>
-          <w:sz w:val="28"/>
-        </w:rPr>
-        <w:t>3.1 Vulnerability Classification Matrix</w:t>
-      </w:r>
-    </w:p>
-    <w:tbl>
-      <w:tblPr>
-        <w:tblW w:type="auto" w:w="0"/>
-        <w:jc w:val="center"/>
-        <w:tblLook w:firstColumn="1" w:firstRow="1" w:lastColumn="0" w:lastRow="0" w:noHBand="0" w:noVBand="1" w:val="04A0"/>
-      </w:tblPr>
-      <w:tblGrid>
-        <w:gridCol w:w="1872"/>
-        <w:gridCol w:w="1872"/>
-        <w:gridCol w:w="1872"/>
-        <w:gridCol w:w="1872"/>
-        <w:gridCol w:w="1872"/>
-      </w:tblGrid>
-      <w:tr>
-        <w:tc>
-          <w:tcPr>
-            <w:tcW w:type="dxa" w:w="1872"/>
-            <w:shd w:fill="0B1426"/>
-          </w:tcPr>
-          <w:p>
-            <w:r>
-              <w:rPr>
-                <w:b/>
-                <w:color w:val="FFFFFF"/>
-              </w:rPr>
-              <w:t>ID</w:t>
-            </w:r>
-          </w:p>
-        </w:tc>
-        <w:tc>
-          <w:tcPr>
-            <w:tcW w:type="dxa" w:w="1872"/>
-            <w:shd w:fill="0B1426"/>
-          </w:tcPr>
-          <w:p>
-            <w:r>
-              <w:rPr>
-                <w:b/>
-                <w:color w:val="FFFFFF"/>
-              </w:rPr>
-              <w:t>Identified Vulnerability</w:t>
-            </w:r>
-          </w:p>
-        </w:tc>
-        <w:tc>
-          <w:tcPr>
-            <w:tcW w:type="dxa" w:w="1872"/>
-            <w:shd w:fill="0B1426"/>
-          </w:tcPr>
-          <w:p>
-            <w:r>
-              <w:rPr>
-                <w:b/>
-                <w:color w:val="FFFFFF"/>
-              </w:rPr>
-              <w:t>Category</w:t>
-            </w:r>
-          </w:p>
-        </w:tc>
-        <w:tc>
-          <w:tcPr>
-            <w:tcW w:type="dxa" w:w="1872"/>
-            <w:shd w:fill="0B1426"/>
-          </w:tcPr>
-          <w:p>
-            <w:r>
-              <w:rPr>
-                <w:b/>
-                <w:color w:val="FFFFFF"/>
-              </w:rPr>
-              <w:t>Risk</w:t>
-            </w:r>
-          </w:p>
-        </w:tc>
-        <w:tc>
-          <w:tcPr>
-            <w:tcW w:type="dxa" w:w="1872"/>
-            <w:shd w:fill="0B1426"/>
-          </w:tcPr>
-          <w:p>
-            <w:r>
-              <w:rPr>
-                <w:b/>
-                <w:color w:val="FFFFFF"/>
-              </w:rPr>
-              <w:t>Status</w:t>
-            </w:r>
-          </w:p>
-        </w:tc>
-      </w:tr>
-      <w:tr>
-        <w:tc>
-          <w:tcPr>
-            <w:tcW w:type="dxa" w:w="1872"/>
-            <w:shd w:fill="F8FAFC"/>
-            <w:tcMar>
-              <w:top w:w="50" w:type="dxa"/>
-              <w:bottom w:w="50" w:type="dxa"/>
-              <w:left w:w="80" w:type="dxa"/>
-              <w:right w:w="80" w:type="dxa"/>
-            </w:tcMar>
-          </w:tcPr>
-          <w:p>
-            <w:r>
-              <w:t>SEC-01</w:t>
-            </w:r>
-          </w:p>
-        </w:tc>
-        <w:tc>
-          <w:tcPr>
-            <w:tcW w:type="dxa" w:w="1872"/>
-            <w:shd w:fill="F8FAFC"/>
-            <w:tcMar>
-              <w:top w:w="50" w:type="dxa"/>
-              <w:bottom w:w="50" w:type="dxa"/>
-              <w:left w:w="80" w:type="dxa"/>
-              <w:right w:w="80" w:type="dxa"/>
-            </w:tcMar>
-          </w:tcPr>
-          <w:p>
-            <w:r>
-              <w:t>Unauthenticated Opportunity Insertion</w:t>
-            </w:r>
-          </w:p>
-        </w:tc>
-        <w:tc>
-          <w:tcPr>
-            <w:tcW w:type="dxa" w:w="1872"/>
-            <w:shd w:fill="F8FAFC"/>
-            <w:tcMar>
-              <w:top w:w="50" w:type="dxa"/>
-              <w:bottom w:w="50" w:type="dxa"/>
-              <w:left w:w="80" w:type="dxa"/>
-              <w:right w:w="80" w:type="dxa"/>
-            </w:tcMar>
-          </w:tcPr>
-          <w:p>
-            <w:r>
-              <w:t>Authentication</w:t>
-            </w:r>
-          </w:p>
-        </w:tc>
-        <w:tc>
-          <w:tcPr>
-            <w:tcW w:type="dxa" w:w="1872"/>
-            <w:shd w:fill="F8FAFC"/>
-            <w:tcMar>
-              <w:top w:w="50" w:type="dxa"/>
-              <w:bottom w:w="50" w:type="dxa"/>
-              <w:left w:w="80" w:type="dxa"/>
-              <w:right w:w="80" w:type="dxa"/>
-            </w:tcMar>
-          </w:tcPr>
-          <w:p>
-            <w:r>
-              <w:rPr>
-                <w:b/>
-                <w:color w:val="DC2626"/>
-              </w:rPr>
-              <w:t>HIGH</w:t>
-            </w:r>
-          </w:p>
-        </w:tc>
-        <w:tc>
-          <w:tcPr>
-            <w:tcW w:type="dxa" w:w="1872"/>
-            <w:shd w:fill="F8FAFC"/>
-            <w:tcMar>
-              <w:top w:w="50" w:type="dxa"/>
-              <w:bottom w:w="50" w:type="dxa"/>
-              <w:left w:w="80" w:type="dxa"/>
-              <w:right w:w="80" w:type="dxa"/>
-            </w:tcMar>
-          </w:tcPr>
-          <w:p>
-            <w:r>
-              <w:rPr>
-                <w:b/>
-                <w:color w:val="10B981"/>
-              </w:rPr>
-              <w:t>Remediated</w:t>
-            </w:r>
-          </w:p>
-        </w:tc>
-      </w:tr>
-      <w:tr>
-        <w:tc>
-          <w:tcPr>
-            <w:tcW w:type="dxa" w:w="1872"/>
-            <w:shd w:fill="FFFFFF"/>
-            <w:tcMar>
-              <w:top w:w="50" w:type="dxa"/>
-              <w:bottom w:w="50" w:type="dxa"/>
-              <w:left w:w="80" w:type="dxa"/>
-              <w:right w:w="80" w:type="dxa"/>
-            </w:tcMar>
-          </w:tcPr>
-          <w:p>
-            <w:r>
-              <w:t>SEC-02</w:t>
-            </w:r>
-          </w:p>
-        </w:tc>
-        <w:tc>
-          <w:tcPr>
-            <w:tcW w:type="dxa" w:w="1872"/>
-            <w:shd w:fill="FFFFFF"/>
-            <w:tcMar>
-              <w:top w:w="50" w:type="dxa"/>
-              <w:bottom w:w="50" w:type="dxa"/>
-              <w:left w:w="80" w:type="dxa"/>
-              <w:right w:w="80" w:type="dxa"/>
-            </w:tcMar>
-          </w:tcPr>
-          <w:p>
-            <w:r>
-              <w:t>Plaintext / Missing Password Hashing</w:t>
-            </w:r>
-          </w:p>
-        </w:tc>
-        <w:tc>
-          <w:tcPr>
-            <w:tcW w:type="dxa" w:w="1872"/>
-            <w:shd w:fill="FFFFFF"/>
-            <w:tcMar>
-              <w:top w:w="50" w:type="dxa"/>
-              <w:bottom w:w="50" w:type="dxa"/>
-              <w:left w:w="80" w:type="dxa"/>
-              <w:right w:w="80" w:type="dxa"/>
-            </w:tcMar>
-          </w:tcPr>
-          <w:p>
-            <w:r>
-              <w:t>Password Storage</w:t>
-            </w:r>
-          </w:p>
-        </w:tc>
-        <w:tc>
-          <w:tcPr>
-            <w:tcW w:type="dxa" w:w="1872"/>
-            <w:shd w:fill="FFFFFF"/>
-            <w:tcMar>
-              <w:top w:w="50" w:type="dxa"/>
-              <w:bottom w:w="50" w:type="dxa"/>
-              <w:left w:w="80" w:type="dxa"/>
-              <w:right w:w="80" w:type="dxa"/>
-            </w:tcMar>
-          </w:tcPr>
-          <w:p>
-            <w:r>
-              <w:rPr>
-                <w:b/>
-                <w:color w:val="DC2626"/>
-              </w:rPr>
-              <w:t>HIGH</w:t>
-            </w:r>
-          </w:p>
-        </w:tc>
-        <w:tc>
-          <w:tcPr>
-            <w:tcW w:type="dxa" w:w="1872"/>
-            <w:shd w:fill="FFFFFF"/>
-            <w:tcMar>
-              <w:top w:w="50" w:type="dxa"/>
-              <w:bottom w:w="50" w:type="dxa"/>
-              <w:left w:w="80" w:type="dxa"/>
-              <w:right w:w="80" w:type="dxa"/>
-            </w:tcMar>
-          </w:tcPr>
-          <w:p>
-            <w:r>
-              <w:rPr>
-                <w:b/>
-                <w:color w:val="10B981"/>
-              </w:rPr>
-              <w:t>Remediated</w:t>
-            </w:r>
-          </w:p>
-        </w:tc>
-      </w:tr>
-      <w:tr>
-        <w:tc>
-          <w:tcPr>
-            <w:tcW w:type="dxa" w:w="1872"/>
-            <w:shd w:fill="F8FAFC"/>
-            <w:tcMar>
-              <w:top w:w="50" w:type="dxa"/>
-              <w:bottom w:w="50" w:type="dxa"/>
-              <w:left w:w="80" w:type="dxa"/>
-              <w:right w:w="80" w:type="dxa"/>
-            </w:tcMar>
-          </w:tcPr>
-          <w:p>
-            <w:r>
-              <w:t>SEC-03</w:t>
-            </w:r>
-          </w:p>
-        </w:tc>
-        <w:tc>
-          <w:tcPr>
-            <w:tcW w:type="dxa" w:w="1872"/>
-            <w:shd w:fill="F8FAFC"/>
-            <w:tcMar>
-              <w:top w:w="50" w:type="dxa"/>
-              <w:bottom w:w="50" w:type="dxa"/>
-              <w:left w:w="80" w:type="dxa"/>
-              <w:right w:w="80" w:type="dxa"/>
-            </w:tcMar>
-          </w:tcPr>
-          <w:p>
-            <w:r>
-              <w:t>Imperative / Unsanitized Input Payloads</w:t>
-            </w:r>
-          </w:p>
-        </w:tc>
-        <w:tc>
-          <w:tcPr>
-            <w:tcW w:type="dxa" w:w="1872"/>
-            <w:shd w:fill="F8FAFC"/>
-            <w:tcMar>
-              <w:top w:w="50" w:type="dxa"/>
-              <w:bottom w:w="50" w:type="dxa"/>
-              <w:left w:w="80" w:type="dxa"/>
-              <w:right w:w="80" w:type="dxa"/>
-            </w:tcMar>
-          </w:tcPr>
-          <w:p>
-            <w:r>
-              <w:t>Input Validation</w:t>
-            </w:r>
-          </w:p>
-        </w:tc>
-        <w:tc>
-          <w:tcPr>
-            <w:tcW w:type="dxa" w:w="1872"/>
-            <w:shd w:fill="F8FAFC"/>
-            <w:tcMar>
-              <w:top w:w="50" w:type="dxa"/>
-              <w:bottom w:w="50" w:type="dxa"/>
-              <w:left w:w="80" w:type="dxa"/>
-              <w:right w:w="80" w:type="dxa"/>
-            </w:tcMar>
-          </w:tcPr>
-          <w:p>
-            <w:r>
-              <w:rPr>
-                <w:b/>
-                <w:color w:val="DC2626"/>
-              </w:rPr>
-              <w:t>HIGH</w:t>
-            </w:r>
-          </w:p>
-        </w:tc>
-        <w:tc>
-          <w:tcPr>
-            <w:tcW w:type="dxa" w:w="1872"/>
-            <w:shd w:fill="F8FAFC"/>
-            <w:tcMar>
-              <w:top w:w="50" w:type="dxa"/>
-              <w:bottom w:w="50" w:type="dxa"/>
-              <w:left w:w="80" w:type="dxa"/>
-              <w:right w:w="80" w:type="dxa"/>
-            </w:tcMar>
-          </w:tcPr>
-          <w:p>
-            <w:r>
-              <w:rPr>
-                <w:b/>
-                <w:color w:val="10B981"/>
-              </w:rPr>
-              <w:t>Remediated</w:t>
-            </w:r>
-          </w:p>
-        </w:tc>
-      </w:tr>
-      <w:tr>
-        <w:tc>
-          <w:tcPr>
-            <w:tcW w:type="dxa" w:w="1872"/>
-            <w:shd w:fill="FFFFFF"/>
-            <w:tcMar>
-              <w:top w:w="50" w:type="dxa"/>
-              <w:bottom w:w="50" w:type="dxa"/>
-              <w:left w:w="80" w:type="dxa"/>
-              <w:right w:w="80" w:type="dxa"/>
-            </w:tcMar>
-          </w:tcPr>
-          <w:p>
-            <w:r>
-              <w:t>SEC-04</w:t>
-            </w:r>
-          </w:p>
-        </w:tc>
-        <w:tc>
-          <w:tcPr>
-            <w:tcW w:type="dxa" w:w="1872"/>
-            <w:shd w:fill="FFFFFF"/>
-            <w:tcMar>
-              <w:top w:w="50" w:type="dxa"/>
-              <w:bottom w:w="50" w:type="dxa"/>
-              <w:left w:w="80" w:type="dxa"/>
-              <w:right w:w="80" w:type="dxa"/>
-            </w:tcMar>
-          </w:tcPr>
-          <w:p>
-            <w:r>
-              <w:t>Regex Wildcard Exploitation / ReDoS</w:t>
-            </w:r>
-          </w:p>
-        </w:tc>
-        <w:tc>
-          <w:tcPr>
-            <w:tcW w:type="dxa" w:w="1872"/>
-            <w:shd w:fill="FFFFFF"/>
-            <w:tcMar>
-              <w:top w:w="50" w:type="dxa"/>
-              <w:bottom w:w="50" w:type="dxa"/>
-              <w:left w:w="80" w:type="dxa"/>
-              <w:right w:w="80" w:type="dxa"/>
-            </w:tcMar>
-          </w:tcPr>
-          <w:p>
-            <w:r>
-              <w:t>NoSQL / DoS</w:t>
-            </w:r>
-          </w:p>
-        </w:tc>
-        <w:tc>
-          <w:tcPr>
-            <w:tcW w:type="dxa" w:w="1872"/>
-            <w:shd w:fill="FFFFFF"/>
-            <w:tcMar>
-              <w:top w:w="50" w:type="dxa"/>
-              <w:bottom w:w="50" w:type="dxa"/>
-              <w:left w:w="80" w:type="dxa"/>
-              <w:right w:w="80" w:type="dxa"/>
-            </w:tcMar>
-          </w:tcPr>
-          <w:p>
-            <w:r>
-              <w:rPr>
-                <w:b/>
-                <w:color w:val="D97706"/>
-              </w:rPr>
-              <w:t>MEDIUM</w:t>
-            </w:r>
-          </w:p>
-        </w:tc>
-        <w:tc>
-          <w:tcPr>
-            <w:tcW w:type="dxa" w:w="1872"/>
-            <w:shd w:fill="FFFFFF"/>
-            <w:tcMar>
-              <w:top w:w="50" w:type="dxa"/>
-              <w:bottom w:w="50" w:type="dxa"/>
-              <w:left w:w="80" w:type="dxa"/>
-              <w:right w:w="80" w:type="dxa"/>
-            </w:tcMar>
-          </w:tcPr>
-          <w:p>
-            <w:r>
-              <w:rPr>
-                <w:b/>
-                <w:color w:val="10B981"/>
-              </w:rPr>
-              <w:t>Remediated</w:t>
-            </w:r>
-          </w:p>
-        </w:tc>
-      </w:tr>
-      <w:tr>
-        <w:tc>
-          <w:tcPr>
-            <w:tcW w:type="dxa" w:w="1872"/>
-            <w:shd w:fill="F8FAFC"/>
-            <w:tcMar>
-              <w:top w:w="50" w:type="dxa"/>
-              <w:bottom w:w="50" w:type="dxa"/>
-              <w:left w:w="80" w:type="dxa"/>
-              <w:right w:w="80" w:type="dxa"/>
-            </w:tcMar>
-          </w:tcPr>
-          <w:p>
-            <w:r>
-              <w:t>SEC-05</w:t>
-            </w:r>
-          </w:p>
-        </w:tc>
-        <w:tc>
-          <w:tcPr>
-            <w:tcW w:type="dxa" w:w="1872"/>
-            <w:shd w:fill="F8FAFC"/>
-            <w:tcMar>
-              <w:top w:w="50" w:type="dxa"/>
-              <w:bottom w:w="50" w:type="dxa"/>
-              <w:left w:w="80" w:type="dxa"/>
-              <w:right w:w="80" w:type="dxa"/>
-            </w:tcMar>
-          </w:tcPr>
-          <w:p>
-            <w:r>
-              <w:t>UI Redressing / Frame Embedding</w:t>
-            </w:r>
-          </w:p>
-        </w:tc>
-        <w:tc>
-          <w:tcPr>
-            <w:tcW w:type="dxa" w:w="1872"/>
-            <w:shd w:fill="F8FAFC"/>
-            <w:tcMar>
-              <w:top w:w="50" w:type="dxa"/>
-              <w:bottom w:w="50" w:type="dxa"/>
-              <w:left w:w="80" w:type="dxa"/>
-              <w:right w:w="80" w:type="dxa"/>
-            </w:tcMar>
-          </w:tcPr>
-          <w:p>
-            <w:r>
-              <w:t>Clickjacking</w:t>
-            </w:r>
-          </w:p>
-        </w:tc>
-        <w:tc>
-          <w:tcPr>
-            <w:tcW w:type="dxa" w:w="1872"/>
-            <w:shd w:fill="F8FAFC"/>
-            <w:tcMar>
-              <w:top w:w="50" w:type="dxa"/>
-              <w:bottom w:w="50" w:type="dxa"/>
-              <w:left w:w="80" w:type="dxa"/>
-              <w:right w:w="80" w:type="dxa"/>
-            </w:tcMar>
-          </w:tcPr>
-          <w:p>
-            <w:r>
-              <w:rPr>
-                <w:b/>
-                <w:color w:val="D97706"/>
-              </w:rPr>
-              <w:t>MEDIUM</w:t>
-            </w:r>
-          </w:p>
-        </w:tc>
-        <w:tc>
-          <w:tcPr>
-            <w:tcW w:type="dxa" w:w="1872"/>
-            <w:shd w:fill="F8FAFC"/>
-            <w:tcMar>
-              <w:top w:w="50" w:type="dxa"/>
-              <w:bottom w:w="50" w:type="dxa"/>
-              <w:left w:w="80" w:type="dxa"/>
-              <w:right w:w="80" w:type="dxa"/>
-            </w:tcMar>
-          </w:tcPr>
-          <w:p>
-            <w:r>
-              <w:rPr>
-                <w:b/>
-                <w:color w:val="10B981"/>
-              </w:rPr>
-              <w:t>Remediated</w:t>
-            </w:r>
-          </w:p>
-        </w:tc>
-      </w:tr>
-      <w:tr>
-        <w:tc>
-          <w:tcPr>
-            <w:tcW w:type="dxa" w:w="1872"/>
-            <w:shd w:fill="FFFFFF"/>
-            <w:tcMar>
-              <w:top w:w="50" w:type="dxa"/>
-              <w:bottom w:w="50" w:type="dxa"/>
-              <w:left w:w="80" w:type="dxa"/>
-              <w:right w:w="80" w:type="dxa"/>
-            </w:tcMar>
-          </w:tcPr>
-          <w:p>
-            <w:r>
-              <w:t>SEC-06</w:t>
-            </w:r>
-          </w:p>
-        </w:tc>
-        <w:tc>
-          <w:tcPr>
-            <w:tcW w:type="dxa" w:w="1872"/>
-            <w:shd w:fill="FFFFFF"/>
-            <w:tcMar>
-              <w:top w:w="50" w:type="dxa"/>
-              <w:bottom w:w="50" w:type="dxa"/>
-              <w:left w:w="80" w:type="dxa"/>
-              <w:right w:w="80" w:type="dxa"/>
-            </w:tcMar>
-          </w:tcPr>
-          <w:p>
-            <w:r>
-              <w:t>MIME Type Confusion / Sniffing</w:t>
-            </w:r>
-          </w:p>
-        </w:tc>
-        <w:tc>
-          <w:tcPr>
-            <w:tcW w:type="dxa" w:w="1872"/>
-            <w:shd w:fill="FFFFFF"/>
-            <w:tcMar>
-              <w:top w:w="50" w:type="dxa"/>
-              <w:bottom w:w="50" w:type="dxa"/>
-              <w:left w:w="80" w:type="dxa"/>
-              <w:right w:w="80" w:type="dxa"/>
-            </w:tcMar>
-          </w:tcPr>
-          <w:p>
-            <w:r>
-              <w:t>MIME Spoofing</w:t>
-            </w:r>
-          </w:p>
-        </w:tc>
-        <w:tc>
-          <w:tcPr>
-            <w:tcW w:type="dxa" w:w="1872"/>
-            <w:shd w:fill="FFFFFF"/>
-            <w:tcMar>
-              <w:top w:w="50" w:type="dxa"/>
-              <w:bottom w:w="50" w:type="dxa"/>
-              <w:left w:w="80" w:type="dxa"/>
-              <w:right w:w="80" w:type="dxa"/>
-            </w:tcMar>
-          </w:tcPr>
-          <w:p>
-            <w:r>
-              <w:rPr>
-                <w:b/>
-                <w:color w:val="D97706"/>
-              </w:rPr>
-              <w:t>LOW</w:t>
-            </w:r>
-          </w:p>
-        </w:tc>
-        <w:tc>
-          <w:tcPr>
-            <w:tcW w:type="dxa" w:w="1872"/>
-            <w:shd w:fill="FFFFFF"/>
-            <w:tcMar>
-              <w:top w:w="50" w:type="dxa"/>
-              <w:bottom w:w="50" w:type="dxa"/>
-              <w:left w:w="80" w:type="dxa"/>
-              <w:right w:w="80" w:type="dxa"/>
-            </w:tcMar>
-          </w:tcPr>
-          <w:p>
-            <w:r>
-              <w:rPr>
-                <w:b/>
-                <w:color w:val="10B981"/>
-              </w:rPr>
-              <w:t>Remediated</w:t>
-            </w:r>
-          </w:p>
-        </w:tc>
-      </w:tr>
-      <w:tr>
-        <w:tc>
-          <w:tcPr>
-            <w:tcW w:type="dxa" w:w="1872"/>
-            <w:shd w:fill="F8FAFC"/>
-            <w:tcMar>
-              <w:top w:w="50" w:type="dxa"/>
-              <w:bottom w:w="50" w:type="dxa"/>
-              <w:left w:w="80" w:type="dxa"/>
-              <w:right w:w="80" w:type="dxa"/>
-            </w:tcMar>
-          </w:tcPr>
-          <w:p>
-            <w:r>
-              <w:t>SEC-07</w:t>
-            </w:r>
-          </w:p>
-        </w:tc>
-        <w:tc>
-          <w:tcPr>
-            <w:tcW w:type="dxa" w:w="1872"/>
-            <w:shd w:fill="F8FAFC"/>
-            <w:tcMar>
-              <w:top w:w="50" w:type="dxa"/>
-              <w:bottom w:w="50" w:type="dxa"/>
-              <w:left w:w="80" w:type="dxa"/>
-              <w:right w:w="80" w:type="dxa"/>
-            </w:tcMar>
-          </w:tcPr>
-          <w:p>
-            <w:r>
-              <w:t>Endpoint Flooding &amp; Resource Exhaustion</w:t>
-            </w:r>
-          </w:p>
-        </w:tc>
-        <w:tc>
-          <w:tcPr>
-            <w:tcW w:type="dxa" w:w="1872"/>
-            <w:shd w:fill="F8FAFC"/>
-            <w:tcMar>
-              <w:top w:w="50" w:type="dxa"/>
-              <w:bottom w:w="50" w:type="dxa"/>
-              <w:left w:w="80" w:type="dxa"/>
-              <w:right w:w="80" w:type="dxa"/>
-            </w:tcMar>
-          </w:tcPr>
-          <w:p>
-            <w:r>
-              <w:t>Availability / DoS</w:t>
-            </w:r>
-          </w:p>
-        </w:tc>
-        <w:tc>
-          <w:tcPr>
-            <w:tcW w:type="dxa" w:w="1872"/>
-            <w:shd w:fill="F8FAFC"/>
-            <w:tcMar>
-              <w:top w:w="50" w:type="dxa"/>
-              <w:bottom w:w="50" w:type="dxa"/>
-              <w:left w:w="80" w:type="dxa"/>
-              <w:right w:w="80" w:type="dxa"/>
-            </w:tcMar>
-          </w:tcPr>
-          <w:p>
-            <w:r>
-              <w:rPr>
-                <w:b/>
-                <w:color w:val="D97706"/>
-              </w:rPr>
-              <w:t>MEDIUM</w:t>
-            </w:r>
-          </w:p>
-        </w:tc>
-        <w:tc>
-          <w:tcPr>
-            <w:tcW w:type="dxa" w:w="1872"/>
-            <w:shd w:fill="F8FAFC"/>
-            <w:tcMar>
-              <w:top w:w="50" w:type="dxa"/>
-              <w:bottom w:w="50" w:type="dxa"/>
-              <w:left w:w="80" w:type="dxa"/>
-              <w:right w:w="80" w:type="dxa"/>
-            </w:tcMar>
-          </w:tcPr>
-          <w:p>
-            <w:r>
-              <w:rPr>
-                <w:b/>
-                <w:color w:val="10B981"/>
-              </w:rPr>
-              <w:t>Remediated</w:t>
-            </w:r>
-          </w:p>
-        </w:tc>
-      </w:tr>
-      <w:tr>
-        <w:tc>
-          <w:tcPr>
-            <w:tcW w:type="dxa" w:w="1872"/>
-            <w:shd w:fill="FFFFFF"/>
-            <w:tcMar>
-              <w:top w:w="50" w:type="dxa"/>
-              <w:bottom w:w="50" w:type="dxa"/>
-              <w:left w:w="80" w:type="dxa"/>
-              <w:right w:w="80" w:type="dxa"/>
-            </w:tcMar>
-          </w:tcPr>
-          <w:p>
-            <w:r>
-              <w:t>SEC-08</w:t>
-            </w:r>
-          </w:p>
-        </w:tc>
-        <w:tc>
-          <w:tcPr>
-            <w:tcW w:type="dxa" w:w="1872"/>
-            <w:shd w:fill="FFFFFF"/>
-            <w:tcMar>
-              <w:top w:w="50" w:type="dxa"/>
-              <w:bottom w:w="50" w:type="dxa"/>
-              <w:left w:w="80" w:type="dxa"/>
-              <w:right w:w="80" w:type="dxa"/>
-            </w:tcMar>
-          </w:tcPr>
-          <w:p>
-            <w:r>
-              <w:t>Database Password Printing in Server Logs</w:t>
-            </w:r>
-          </w:p>
-        </w:tc>
-        <w:tc>
-          <w:tcPr>
-            <w:tcW w:type="dxa" w:w="1872"/>
-            <w:shd w:fill="FFFFFF"/>
-            <w:tcMar>
-              <w:top w:w="50" w:type="dxa"/>
-              <w:bottom w:w="50" w:type="dxa"/>
-              <w:left w:w="80" w:type="dxa"/>
-              <w:right w:w="80" w:type="dxa"/>
-            </w:tcMar>
-          </w:tcPr>
-          <w:p>
-            <w:r>
-              <w:t>Information Leak</w:t>
-            </w:r>
-          </w:p>
-        </w:tc>
-        <w:tc>
-          <w:tcPr>
-            <w:tcW w:type="dxa" w:w="1872"/>
-            <w:shd w:fill="FFFFFF"/>
-            <w:tcMar>
-              <w:top w:w="50" w:type="dxa"/>
-              <w:bottom w:w="50" w:type="dxa"/>
-              <w:left w:w="80" w:type="dxa"/>
-              <w:right w:w="80" w:type="dxa"/>
-            </w:tcMar>
-          </w:tcPr>
-          <w:p>
-            <w:r>
-              <w:rPr>
-                <w:b/>
-                <w:color w:val="D97706"/>
-              </w:rPr>
-              <w:t>MEDIUM</w:t>
-            </w:r>
-          </w:p>
-        </w:tc>
-        <w:tc>
-          <w:tcPr>
-            <w:tcW w:type="dxa" w:w="1872"/>
-            <w:shd w:fill="FFFFFF"/>
-            <w:tcMar>
-              <w:top w:w="50" w:type="dxa"/>
-              <w:bottom w:w="50" w:type="dxa"/>
-              <w:left w:w="80" w:type="dxa"/>
-              <w:right w:w="80" w:type="dxa"/>
-            </w:tcMar>
-          </w:tcPr>
-          <w:p>
-            <w:r>
-              <w:rPr>
-                <w:b/>
-                <w:color w:val="10B981"/>
-              </w:rPr>
-              <w:t>Remediated</w:t>
-            </w:r>
-          </w:p>
-        </w:tc>
-      </w:tr>
-    </w:tbl>
-    <w:p/>
-    <w:p>
-      <w:pPr>
-        <w:pStyle w:val="Heading2"/>
-        <w:spacing w:before="280" w:after="120"/>
-      </w:pPr>
-      <w:r>
-        <w:rPr>
-          <w:b/>
-          <w:color w:val="008CB4"/>
-          <w:sz w:val="28"/>
-        </w:rPr>
-        <w:t>3.2 Vulnerability Deep Dives &amp; Engineering Fixes</w:t>
-      </w:r>
-    </w:p>
-    <w:tbl>
-      <w:tblPr>
-        <w:tblW w:type="auto" w:w="0"/>
-        <w:jc w:val="center"/>
-        <w:tblLook w:firstColumn="1" w:firstRow="1" w:lastColumn="0" w:lastRow="0" w:noHBand="0" w:noVBand="1" w:val="04A0"/>
-      </w:tblPr>
-      <w:tblGrid>
-        <w:gridCol w:w="9360"/>
-      </w:tblGrid>
-      <w:tr>
-        <w:tc>
-          <w:tcPr>
-            <w:tcW w:type="dxa" w:w="9360"/>
-            <w:shd w:fill="FFF5F5"/>
-            <w:tcMar>
-              <w:top w:w="140" w:type="dxa"/>
-              <w:bottom w:w="140" w:type="dxa"/>
-              <w:left w:w="200" w:type="dxa"/>
-              <w:right w:w="200" w:type="dxa"/>
-            </w:tcMar>
-            <w:tcBorders>
-              <w:left w:val="single" w:sz="24" w:space="0" w:color="DC2626"/>
-              <w:top w:val="none"/>
-              <w:right w:val="none"/>
-              <w:bottom w:val="none"/>
-            </w:tcBorders>
-          </w:tcPr>
-          <w:p>
-            <w:pPr>
-              <w:spacing w:before="40" w:after="80"/>
-            </w:pPr>
-            <w:r>
-              <w:rPr>
-                <w:b/>
-                <w:color w:val="0F172A"/>
-                <w:sz w:val="21"/>
-              </w:rPr>
-              <w:t>★ SEC-01: Weak Authentication &amp; Authorization</w:t>
-              <w:br/>
-            </w:r>
-            <w:r>
-              <w:rPr>
-                <w:color w:val="334155"/>
-                <w:sz w:val="19"/>
-              </w:rPr>
-              <w:t>Initial Vulnerability: The POST /api/opportunities endpoint was unauthenticated, allowing any client or bot to flood the database with bogus postings.</w:t>
-              <w:br/>
-              <w:t>Potential Impact: Spam distribution, denial of storage, integrity loss.</w:t>
-              <w:br/>
-              <w:t>Implemented Fix: Integrated User model with JWT authentication. Routes are protected via protect middleware, ensuring only authenticated users can post.</w:t>
-            </w:r>
-          </w:p>
-        </w:tc>
-      </w:tr>
-    </w:tbl>
-    <w:p/>
-    <w:tbl>
-      <w:tblPr>
-        <w:tblW w:type="auto" w:w="0"/>
-        <w:jc w:val="center"/>
-        <w:tblLook w:firstColumn="1" w:firstRow="1" w:lastColumn="0" w:lastRow="0" w:noHBand="0" w:noVBand="1" w:val="04A0"/>
-      </w:tblPr>
-      <w:tblGrid>
-        <w:gridCol w:w="9360"/>
-      </w:tblGrid>
-      <w:tr>
-        <w:tc>
-          <w:tcPr>
-            <w:tcW w:type="dxa" w:w="9360"/>
-            <w:shd w:fill="FFF5F5"/>
-            <w:tcMar>
-              <w:top w:w="140" w:type="dxa"/>
-              <w:bottom w:w="140" w:type="dxa"/>
-              <w:left w:w="200" w:type="dxa"/>
-              <w:right w:w="200" w:type="dxa"/>
-            </w:tcMar>
-            <w:tcBorders>
-              <w:left w:val="single" w:sz="24" w:space="0" w:color="DC2626"/>
-              <w:top w:val="none"/>
-              <w:right w:val="none"/>
-              <w:bottom w:val="none"/>
-            </w:tcBorders>
-          </w:tcPr>
-          <w:p>
-            <w:pPr>
-              <w:spacing w:before="40" w:after="80"/>
-            </w:pPr>
-            <w:r>
-              <w:rPr>
-                <w:b/>
-                <w:color w:val="0F172A"/>
-                <w:sz w:val="21"/>
-              </w:rPr>
-              <w:t>★ SEC-02: Insecure Password Storage</w:t>
-              <w:br/>
-            </w:r>
-            <w:r>
-              <w:rPr>
-                <w:color w:val="334155"/>
-                <w:sz w:val="19"/>
-              </w:rPr>
-              <w:t>Initial Vulnerability: Lack of password hashing mechanism in user models.</w:t>
-              <w:br/>
-              <w:t>Potential Impact: Data breach exposes cleartext passwords, leading to credential stuffing across other services.</w:t>
-              <w:br/>
-              <w:t>Implemented Fix: Implemented bcrypt with 10 salt rounds in Mongoose pre-save hook. Passwords are never stored in plaintext and queries exclude password fields by default.</w:t>
-            </w:r>
-          </w:p>
-        </w:tc>
-      </w:tr>
-    </w:tbl>
-    <w:p/>
-    <w:tbl>
-      <w:tblPr>
-        <w:tblW w:type="auto" w:w="0"/>
-        <w:jc w:val="center"/>
-        <w:tblLook w:firstColumn="1" w:firstRow="1" w:lastColumn="0" w:lastRow="0" w:noHBand="0" w:noVBand="1" w:val="04A0"/>
-      </w:tblPr>
-      <w:tblGrid>
-        <w:gridCol w:w="9360"/>
-      </w:tblGrid>
-      <w:tr>
-        <w:tc>
-          <w:tcPr>
-            <w:tcW w:type="dxa" w:w="9360"/>
-            <w:shd w:fill="FFF5F5"/>
-            <w:tcMar>
-              <w:top w:w="140" w:type="dxa"/>
-              <w:bottom w:w="140" w:type="dxa"/>
-              <w:left w:w="200" w:type="dxa"/>
-              <w:right w:w="200" w:type="dxa"/>
-            </w:tcMar>
-            <w:tcBorders>
-              <w:left w:val="single" w:sz="24" w:space="0" w:color="DC2626"/>
-              <w:top w:val="none"/>
-              <w:right w:val="none"/>
-              <w:bottom w:val="none"/>
-            </w:tcBorders>
-          </w:tcPr>
-          <w:p>
-            <w:pPr>
-              <w:spacing w:before="40" w:after="80"/>
-            </w:pPr>
-            <w:r>
-              <w:rPr>
-                <w:b/>
-                <w:color w:val="0F172A"/>
-                <w:sz w:val="21"/>
-              </w:rPr>
-              <w:t>★ SEC-03: Inadequate Input Validation</w:t>
-              <w:br/>
-            </w:r>
-            <w:r>
-              <w:rPr>
-                <w:color w:val="334155"/>
-                <w:sz w:val="19"/>
-              </w:rPr>
-              <w:t>Initial Vulnerability: Controller used manual imperative checks. Malicious fields could be injected into MongoDB documents.</w:t>
-              <w:br/>
-              <w:t>Potential Impact: Mass assignment vulnerabilities, malformed database documents, 500 server crashes.</w:t>
-              <w:br/>
-              <w:t>Implemented Fix: Enforced Joi schema validation with stripUnknown: true. Payloads are strictly sanitized and type-coerced before reaching database controllers.</w:t>
-            </w:r>
-          </w:p>
-        </w:tc>
-      </w:tr>
-    </w:tbl>
-    <w:p/>
-    <w:tbl>
-      <w:tblPr>
-        <w:tblW w:type="auto" w:w="0"/>
-        <w:jc w:val="center"/>
-        <w:tblLook w:firstColumn="1" w:firstRow="1" w:lastColumn="0" w:lastRow="0" w:noHBand="0" w:noVBand="1" w:val="04A0"/>
-      </w:tblPr>
-      <w:tblGrid>
-        <w:gridCol w:w="9360"/>
-      </w:tblGrid>
-      <w:tr>
-        <w:tc>
-          <w:tcPr>
-            <w:tcW w:type="dxa" w:w="9360"/>
-            <w:shd w:fill="FFFDF5"/>
-            <w:tcMar>
-              <w:top w:w="140" w:type="dxa"/>
-              <w:bottom w:w="140" w:type="dxa"/>
-              <w:left w:w="200" w:type="dxa"/>
-              <w:right w:w="200" w:type="dxa"/>
-            </w:tcMar>
-            <w:tcBorders>
-              <w:left w:val="single" w:sz="24" w:space="0" w:color="D97706"/>
-              <w:top w:val="none"/>
-              <w:right w:val="none"/>
-              <w:bottom w:val="none"/>
-            </w:tcBorders>
-          </w:tcPr>
-          <w:p>
-            <w:pPr>
-              <w:spacing w:before="40" w:after="80"/>
-            </w:pPr>
-            <w:r>
-              <w:rPr>
-                <w:b/>
-                <w:color w:val="0F172A"/>
-                <w:sz w:val="21"/>
-              </w:rPr>
-              <w:t>★ SEC-04: NoSQL Injection &amp; ReDoS</w:t>
-              <w:br/>
-            </w:r>
-            <w:r>
-              <w:rPr>
-                <w:color w:val="334155"/>
-                <w:sz w:val="19"/>
-              </w:rPr>
-              <w:t>Initial Vulnerability: Unescaped search terms passed into new RegExp() could trigger catastrophic regex backtracking.</w:t>
-              <w:br/>
-              <w:t>Potential Impact: Freezing the Node.js event loop, resulting in complete denial of service.</w:t>
-              <w:br/>
-              <w:t>Implemented Fix: Implemented escapeRegex() to neutralize special regex characters (^, $, *, +, ?), ensuring safe text matching.</w:t>
-            </w:r>
-          </w:p>
-        </w:tc>
-      </w:tr>
-    </w:tbl>
-    <w:p/>
-    <w:p>
-      <w:r>
-        <w:br w:type="page"/>
-      </w:r>
-    </w:p>
-    <w:p>
-      <w:pPr>
-        <w:pStyle w:val="Heading1"/>
-        <w:spacing w:before="280" w:after="120"/>
-      </w:pPr>
-      <w:r>
-        <w:rPr>
-          <w:b/>
-          <w:color w:val="0B1426"/>
-          <w:sz w:val="36"/>
-        </w:rPr>
-        <w:t>4. Task 3: Implementation &amp; Demonstration of Security Libraries</w:t>
-      </w:r>
-    </w:p>
-    <w:p>
-      <w:r>
-        <w:t>To fulfill AWD Task 3, three critical Node.js security libraries were integrated into Crackly: Helmet.js, bcrypt, and Joi. Below is the code implementation, syntax explanation, and verified test execution output.</w:t>
-      </w:r>
-    </w:p>
-    <w:p>
-      <w:pPr>
-        <w:pStyle w:val="Heading2"/>
-        <w:spacing w:before="280" w:after="120"/>
-      </w:pPr>
-      <w:r>
-        <w:rPr>
-          <w:b/>
-          <w:color w:val="008CB4"/>
-          <w:sz w:val="28"/>
-        </w:rPr>
-        <w:t>4.1 Library 1: Helmet.js (HTTP Security Headers)</w:t>
-      </w:r>
-    </w:p>
-    <w:p>
-      <w:r>
-        <w:t>Helmet secures Express applications by setting critical HTTP response headers. It hides server fingerprints and instructs client browsers to enforce strict security policies.</w:t>
-      </w:r>
-    </w:p>
-    <w:tbl>
-      <w:tblPr>
-        <w:tblW w:type="auto" w:w="0"/>
-        <w:jc w:val="center"/>
-        <w:tblLook w:firstColumn="1" w:firstRow="1" w:lastColumn="0" w:lastRow="0" w:noHBand="0" w:noVBand="1" w:val="04A0"/>
-      </w:tblPr>
-      <w:tblGrid>
-        <w:gridCol w:w="9360"/>
-      </w:tblGrid>
-      <w:tr>
-        <w:tc>
-          <w:tcPr>
-            <w:tcW w:type="dxa" w:w="9360"/>
-            <w:shd w:fill="F1F5F9"/>
-            <w:tcMar>
-              <w:top w:w="120" w:type="dxa"/>
-              <w:bottom w:w="120" w:type="dxa"/>
-              <w:left w:w="180" w:type="dxa"/>
-              <w:right w:w="180" w:type="dxa"/>
-            </w:tcMar>
-          </w:tcPr>
-          <w:p>
-            <w:pPr>
-              <w:spacing w:before="40" w:after="40" w:line="276" w:lineRule="auto"/>
-            </w:pPr>
-            <w:r>
-              <w:rPr>
-                <w:rFonts w:ascii="Consolas" w:hAnsi="Consolas"/>
-                <w:color w:val="0F172A"/>
-                <w:sz w:val="17"/>
-              </w:rPr>
-              <w:t>// server/server.js</w:t>
-              <w:br/>
-              <w:t>import helmet from 'helmet';</w:t>
-              <w:br/>
-              <w:br/>
-              <w:t>app.use(helmet({</w:t>
-              <w:br/>
-              <w:t xml:space="preserve">  frameguard: { action: 'deny' },     // X-Frame-Options: DENY (Clickjacking defense)</w:t>
-              <w:br/>
-              <w:t xml:space="preserve">  noSniff: true,                      // X-Content-Type-Options: nosniff (MIME defense)</w:t>
-              <w:br/>
-              <w:t xml:space="preserve">  hidePoweredBy: true,                // Suppresses X-Powered-By: Express</w:t>
-              <w:br/>
-              <w:t xml:space="preserve">  hsts: { maxAge: 31536000 },         // Strict-Transport-Security (HTTPS enforcement)</w:t>
-              <w:br/>
-              <w:t xml:space="preserve">  contentSecurityPolicy: { ... }      // Content-Security-Policy (XSS &amp; injection defense)</w:t>
-              <w:br/>
-              <w:t>}));</w:t>
-            </w:r>
-          </w:p>
-        </w:tc>
-      </w:tr>
-    </w:tbl>
-    <w:p/>
-    <w:p>
-      <w:pPr>
-        <w:pStyle w:val="Heading2"/>
-        <w:spacing w:before="280" w:after="120"/>
-      </w:pPr>
-      <w:r>
-        <w:rPr>
-          <w:b/>
-          <w:color w:val="008CB4"/>
-          <w:sz w:val="28"/>
-        </w:rPr>
-        <w:t>4.2 Library 2: bcrypt (Cryptographic Password Hashing)</w:t>
-      </w:r>
-    </w:p>
-    <w:p>
-      <w:r>
-        <w:t>bcrypt uses an adaptive Blowfish key derivation algorithm with unique salting (cost 10 = 1024 rounds). It protects passwords against offline dictionary and precomputed Rainbow Table attacks.</w:t>
-      </w:r>
-    </w:p>
-    <w:tbl>
-      <w:tblPr>
-        <w:tblW w:type="auto" w:w="0"/>
-        <w:jc w:val="center"/>
-        <w:tblLook w:firstColumn="1" w:firstRow="1" w:lastColumn="0" w:lastRow="0" w:noHBand="0" w:noVBand="1" w:val="04A0"/>
-      </w:tblPr>
-      <w:tblGrid>
-        <w:gridCol w:w="9360"/>
-      </w:tblGrid>
-      <w:tr>
-        <w:tc>
-          <w:tcPr>
-            <w:tcW w:type="dxa" w:w="9360"/>
-            <w:shd w:fill="F1F5F9"/>
-            <w:tcMar>
-              <w:top w:w="120" w:type="dxa"/>
-              <w:bottom w:w="120" w:type="dxa"/>
-              <w:left w:w="180" w:type="dxa"/>
-              <w:right w:w="180" w:type="dxa"/>
-            </w:tcMar>
-          </w:tcPr>
-          <w:p>
-            <w:pPr>
-              <w:spacing w:before="40" w:after="40" w:line="276" w:lineRule="auto"/>
-            </w:pPr>
-            <w:r>
-              <w:rPr>
-                <w:rFonts w:ascii="Consolas" w:hAnsi="Consolas"/>
-                <w:color w:val="0F172A"/>
-                <w:sz w:val="17"/>
-              </w:rPr>
-              <w:t>// server/models/User.js</w:t>
-              <w:br/>
-              <w:t>userSchema.pre('save', async function(next) {</w:t>
-              <w:br/>
-              <w:t xml:space="preserve">  if (!this.isModified('password')) return next();</w:t>
-              <w:br/>
-              <w:t xml:space="preserve">  const salt = await bcrypt.genSalt(10);           // Generate 128-bit unique salt</w:t>
-              <w:br/>
-              <w:t xml:space="preserve">  this.password = await bcrypt.hash(this.password, salt); // One-way adaptive hash</w:t>
-              <w:br/>
-              <w:t xml:space="preserve">  next();</w:t>
-              <w:br/>
-              <w:t>});</w:t>
-              <w:br/>
-              <w:br/>
-              <w:t>userSchema.methods.comparePassword = async function(candidatePassword) {</w:t>
-              <w:br/>
-              <w:t xml:space="preserve">  return await bcrypt.compare(candidatePassword, this.password); // Constant-time verification</w:t>
-              <w:br/>
-              <w:t>};</w:t>
-            </w:r>
-          </w:p>
-        </w:tc>
-      </w:tr>
-    </w:tbl>
-    <w:p/>
-    <w:p>
-      <w:pPr>
-        <w:pStyle w:val="Heading2"/>
-        <w:spacing w:before="280" w:after="120"/>
-      </w:pPr>
-      <w:r>
-        <w:rPr>
-          <w:b/>
-          <w:color w:val="008CB4"/>
-          <w:sz w:val="28"/>
-        </w:rPr>
-        <w:t>4.3 Library 3: Joi (Input Validation &amp; Schema Enforcement)</w:t>
-      </w:r>
-    </w:p>
-    <w:p>
-      <w:r>
-        <w:t>Joi provides declarative validation middleware that intercepts incoming requests, strips unknown fields, and enforces bounds on strings, enums, dates, and URIs.</w:t>
-      </w:r>
-    </w:p>
-    <w:tbl>
-      <w:tblPr>
-        <w:tblW w:type="auto" w:w="0"/>
-        <w:jc w:val="center"/>
-        <w:tblLook w:firstColumn="1" w:firstRow="1" w:lastColumn="0" w:lastRow="0" w:noHBand="0" w:noVBand="1" w:val="04A0"/>
-      </w:tblPr>
-      <w:tblGrid>
-        <w:gridCol w:w="9360"/>
-      </w:tblGrid>
-      <w:tr>
-        <w:tc>
-          <w:tcPr>
-            <w:tcW w:type="dxa" w:w="9360"/>
-            <w:shd w:fill="F1F5F9"/>
-            <w:tcMar>
-              <w:top w:w="120" w:type="dxa"/>
-              <w:bottom w:w="120" w:type="dxa"/>
-              <w:left w:w="180" w:type="dxa"/>
-              <w:right w:w="180" w:type="dxa"/>
-            </w:tcMar>
-          </w:tcPr>
-          <w:p>
-            <w:pPr>
-              <w:spacing w:before="40" w:after="40" w:line="276" w:lineRule="auto"/>
-            </w:pPr>
-            <w:r>
-              <w:rPr>
-                <w:rFonts w:ascii="Consolas" w:hAnsi="Consolas"/>
-                <w:color w:val="0F172A"/>
-                <w:sz w:val="17"/>
-              </w:rPr>
-              <w:t>// server/validations/opportunityValidation.js</w:t>
-              <w:br/>
-              <w:t>export const createOpportunitySchema = Joi.object({</w:t>
-              <w:br/>
-              <w:t xml:space="preserve">  title: Joi.string().trim().min(3).max(150).required(),</w:t>
-              <w:br/>
-              <w:t xml:space="preserve">  company: Joi.string().trim().min(2).max(100).required(),</w:t>
-              <w:br/>
-              <w:t xml:space="preserve">  category: Joi.string().valid('Hackathon', 'Internship', 'Fresher Job').required(),</w:t>
-              <w:br/>
-              <w:t xml:space="preserve">  applicationUrl: Joi.string().uri({ scheme: ['http', 'https'] }).allow('').default(''),</w:t>
-              <w:br/>
-              <w:t xml:space="preserve">  workMode: Joi.string().valid('Remote', 'In-Person', 'Hybrid').default('Remote')</w:t>
-              <w:br/>
-              <w:t>});</w:t>
-              <w:br/>
-              <w:br/>
-              <w:t>// Generic Middleware in server/middleware/validate.js</w:t>
-              <w:br/>
-              <w:t>export const validate = (schema, property = 'body') =&gt; (req, res, next) =&gt; {</w:t>
-              <w:br/>
-              <w:t xml:space="preserve">  const { error, value } = schema.validate(req[property], { abortEarly: false, stripUnknown: true });</w:t>
-              <w:br/>
-              <w:t xml:space="preserve">  if (error) return res.status(400).json({ success: false, errors: error.details.map(d =&gt; d.message) });</w:t>
-              <w:br/>
-              <w:t xml:space="preserve">  req[property] = value;</w:t>
-              <w:br/>
-              <w:t xml:space="preserve">  next();</w:t>
-              <w:br/>
-              <w:t>};</w:t>
-            </w:r>
-          </w:p>
-        </w:tc>
-      </w:tr>
-    </w:tbl>
-    <w:p/>
-    <w:p>
-      <w:pPr>
-        <w:pStyle w:val="Heading2"/>
-        <w:spacing w:before="280" w:after="120"/>
-      </w:pPr>
-      <w:r>
-        <w:rPr>
-          <w:b/>
-          <w:color w:val="008CB4"/>
-          <w:sz w:val="28"/>
-        </w:rPr>
-        <w:t>4.4 Automated Demonstration Script &amp; Actual Execution Results</w:t>
-      </w:r>
-    </w:p>
-    <w:p>
-      <w:r>
-        <w:t>A dedicated verification script (server/demonstrate_security.js) was created and executed via `npm run demonstrate:security`. Below is the verbatim execution output verifying all three libraries:</w:t>
-      </w:r>
-    </w:p>
-    <w:tbl>
-      <w:tblPr>
-        <w:tblW w:type="auto" w:w="0"/>
-        <w:jc w:val="center"/>
-        <w:tblLook w:firstColumn="1" w:firstRow="1" w:lastColumn="0" w:lastRow="0" w:noHBand="0" w:noVBand="1" w:val="04A0"/>
-      </w:tblPr>
-      <w:tblGrid>
-        <w:gridCol w:w="9360"/>
-      </w:tblGrid>
-      <w:tr>
-        <w:tc>
-          <w:tcPr>
-            <w:tcW w:type="dxa" w:w="9360"/>
-            <w:shd w:fill="F1F5F9"/>
-            <w:tcMar>
-              <w:top w:w="120" w:type="dxa"/>
-              <w:bottom w:w="120" w:type="dxa"/>
-              <w:left w:w="180" w:type="dxa"/>
-              <w:right w:w="180" w:type="dxa"/>
-            </w:tcMar>
-          </w:tcPr>
-          <w:p>
-            <w:pPr>
-              <w:spacing w:before="40" w:after="40" w:line="276" w:lineRule="auto"/>
-            </w:pPr>
-            <w:r>
-              <w:rPr>
-                <w:rFonts w:ascii="Consolas" w:hAnsi="Consolas"/>
-                <w:color w:val="0F172A"/>
-                <w:sz w:val="17"/>
-              </w:rPr>
-              <w:t>========================================================================</w:t>
-              <w:br/>
-              <w:t xml:space="preserve">       AWD PBL PROJECT: SECURITY LIBRARIES DEMONSTRATION &amp; VERIFICATION</w:t>
-              <w:br/>
-              <w:t xml:space="preserve">       Libraries: Helmet.js, bcrypt, and Joi</w:t>
-              <w:br/>
-              <w:t>========================================================================</w:t>
-              <w:br/>
-              <w:br/>
-              <w:t>&gt;&gt;&gt; 1. DEMONSTRATION OF HELMET.JS (HTTP Security Headers)</w:t>
-              <w:br/>
-              <w:t xml:space="preserve">  ✔ [PASS] Header [x-frame-options]: "DENY" (Clickjacking prevention)</w:t>
-              <w:br/>
-              <w:t xml:space="preserve">  ✔ [PASS] Header [x-content-type-options]: "nosniff" (MIME sniffing mitigation)</w:t>
-              <w:br/>
-              <w:t xml:space="preserve">  ✔ [PASS] Header [x-xss-protection]: "0" (Modern CSP standard)</w:t>
-              <w:br/>
-              <w:t xml:space="preserve">  ✔ [PASS] Header [content-security-policy]: Active CSP directives</w:t>
-              <w:br/>
-              <w:t xml:space="preserve">  ✔ [PASS] Header [strict-transport-security]: "max-age=15552000; includeSubDomains"</w:t>
-              <w:br/>
-              <w:t xml:space="preserve">  ✔ [PASS] Header [x-powered-by] is suppressed (Express signature hidden)</w:t>
-              <w:br/>
-              <w:br/>
-              <w:t>&gt;&gt;&gt; 2. DEMONSTRATION OF BCRYPT (Password Hashing &amp; Verification)</w:t>
-              <w:br/>
-              <w:t xml:space="preserve">  • Plaintext Password: "SuperSecretPassword@2026"</w:t>
-              <w:br/>
-              <w:t xml:space="preserve">  ✔ [PASS] Password hashed with bcrypt cost factor 10 in 86ms</w:t>
-              <w:br/>
-              <w:t xml:space="preserve">  • Generated Salt: $2b$10$FRvgpblEOHYHoIs2ILq.Ku</w:t>
-              <w:br/>
-              <w:t xml:space="preserve">  • Generated Hash #1: $2b$10$FRvgpblEOHYHoIs2ILq.KuGK4uOPyM62FOEuJyUXIAMBUll/KYzhK</w:t>
-              <w:br/>
-              <w:t xml:space="preserve">  • Generated Hash #2: $2b$10$M4jkq5RbeChWh2dzJzocae9/mbyT.qwv3fLy5fpJkgiCf0U.hNdDy</w:t>
-              <w:br/>
-              <w:t xml:space="preserve">  ✔ [PASS] Unique Salt Proof: Same password generated two completely different hashes.</w:t>
-              <w:br/>
-              <w:t xml:space="preserve">  ✔ [PASS] bcrypt.compare(correctPassword, hash) === TRUE (Authentication Successful)</w:t>
-              <w:br/>
-              <w:t xml:space="preserve">  ✔ [PASS] bcrypt.compare(wrongPassword, hash) === FALSE (Unauthorized Access Blocked)</w:t>
-              <w:br/>
-              <w:br/>
-              <w:t>&gt;&gt;&gt; 3. DEMONSTRATION OF JOI (Input Validation &amp; Schema Enforcement)</w:t>
-              <w:br/>
-              <w:t xml:space="preserve">  ✔ [PASS] Valid Opportunity payload passed Joi validation cleanly</w:t>
-              <w:br/>
-              <w:t xml:space="preserve">  ✔ [PASS] Malformed input caught by Joi: Blocked 4 validation violations:</w:t>
-              <w:br/>
-              <w:t xml:space="preserve">     [Violation 1] title: Opportunity title must be at least 3 characters</w:t>
-              <w:br/>
-              <w:t xml:space="preserve">     [Violation 2] company: Company or organization name is required</w:t>
-              <w:br/>
-              <w:t xml:space="preserve">     [Violation 3] category: Category must be one of: Hackathon, Internship, Fresher Job</w:t>
-              <w:br/>
-              <w:t xml:space="preserve">     [Violation 4] applicationUrl: must be a valid uri with http|https pattern</w:t>
-              <w:br/>
-              <w:t xml:space="preserve">  ✔ [PASS] Mass-Assignment Protection: Unknown key 'unknownHackerField' was stripped.</w:t>
-              <w:br/>
-              <w:br/>
-              <w:t>&gt;&gt;&gt; FINAL VERIFICATION SUMMARY</w:t>
-              <w:br/>
-              <w:t xml:space="preserve">  ✔ 1. Helmet.js: Successfully Verified (HTTP security headers configured &amp; active)</w:t>
-              <w:br/>
-              <w:t xml:space="preserve">  ✔ 2. bcrypt:    Successfully Verified (Adaptive hashing, salt uniqueness &amp; verification)</w:t>
-              <w:br/>
-              <w:t xml:space="preserve">  ✔ 3. Joi:       Successfully Verified (Payload schemas, field validation &amp; sanitization)</w:t>
-              <w:br/>
-              <w:t>All Task-3 security libraries are 100% functional and production-ready for AWD viva-voce!</w:t>
-            </w:r>
-          </w:p>
-        </w:tc>
-      </w:tr>
-    </w:tbl>
-    <w:p/>
-    <w:p>
-      <w:r>
-        <w:br w:type="page"/>
-      </w:r>
-    </w:p>
-    <w:p>
-      <w:pPr>
-        <w:pStyle w:val="Heading1"/>
-        <w:spacing w:before="280" w:after="120"/>
-      </w:pPr>
-      <w:r>
-        <w:rPr>
-          <w:b/>
-          <w:color w:val="0B1426"/>
-          <w:sz w:val="36"/>
-        </w:rPr>
-        <w:t>5. Viva-Voce Oral Defense Guide (Anticipated Questions &amp; Answers)</w:t>
-      </w:r>
-    </w:p>
-    <w:tbl>
-      <w:tblPr>
-        <w:tblW w:type="auto" w:w="0"/>
-        <w:jc w:val="center"/>
-        <w:tblLook w:firstColumn="1" w:firstRow="1" w:lastColumn="0" w:lastRow="0" w:noHBand="0" w:noVBand="1" w:val="04A0"/>
-      </w:tblPr>
-      <w:tblGrid>
-        <w:gridCol w:w="9360"/>
-      </w:tblGrid>
-      <w:tr>
-        <w:tc>
-          <w:tcPr>
-            <w:tcW w:type="dxa" w:w="9360"/>
-            <w:shd w:fill="F0FDF4"/>
-            <w:tcMar>
-              <w:top w:w="140" w:type="dxa"/>
-              <w:bottom w:w="140" w:type="dxa"/>
-              <w:left w:w="200" w:type="dxa"/>
-              <w:right w:w="200" w:type="dxa"/>
-            </w:tcMar>
-            <w:tcBorders>
-              <w:left w:val="single" w:sz="24" w:space="0" w:color="00b4d8"/>
-              <w:top w:val="none"/>
-              <w:right w:val="none"/>
-              <w:bottom w:val="none"/>
-            </w:tcBorders>
-          </w:tcPr>
-          <w:p>
-            <w:pPr>
-              <w:spacing w:before="40" w:after="80"/>
-            </w:pPr>
-            <w:r>
-              <w:rPr>
-                <w:b/>
-                <w:color w:val="0F172A"/>
-                <w:sz w:val="21"/>
-              </w:rPr>
-              <w:t>★ Q1: Why did you choose MongoDB over MySQL for the Crackly opportunity platform?</w:t>
-              <w:br/>
-            </w:r>
-            <w:r>
-              <w:rPr>
-                <w:color w:val="334155"/>
-                <w:sz w:val="19"/>
-              </w:rPr>
-              <w:t>A1: Crackly opportunities have a deeply hierarchical schema. Each opportunity contains a 4-week preparation roadmap, multiple core technical topics, and sample interview questions. In MySQL, storing and retrieving this requires 4 normalized tables and 4 multi-table JOINs, causing high latency. MongoDB stores the entire entity as a rich BSON document, retrieving it in a single indexed read operation (O(1) with Mongoose ObjectId).</w:t>
-            </w:r>
-          </w:p>
-        </w:tc>
-      </w:tr>
-    </w:tbl>
-    <w:p/>
-    <w:tbl>
-      <w:tblPr>
-        <w:tblW w:type="auto" w:w="0"/>
-        <w:jc w:val="center"/>
-        <w:tblLook w:firstColumn="1" w:firstRow="1" w:lastColumn="0" w:lastRow="0" w:noHBand="0" w:noVBand="1" w:val="04A0"/>
-      </w:tblPr>
-      <w:tblGrid>
-        <w:gridCol w:w="9360"/>
-      </w:tblGrid>
-      <w:tr>
-        <w:tc>
-          <w:tcPr>
-            <w:tcW w:type="dxa" w:w="9360"/>
-            <w:shd w:fill="F0FDF4"/>
-            <w:tcMar>
-              <w:top w:w="140" w:type="dxa"/>
-              <w:bottom w:w="140" w:type="dxa"/>
-              <w:left w:w="200" w:type="dxa"/>
-              <w:right w:w="200" w:type="dxa"/>
-            </w:tcMar>
-            <w:tcBorders>
-              <w:left w:val="single" w:sz="24" w:space="0" w:color="00b4d8"/>
-              <w:top w:val="none"/>
-              <w:right w:val="none"/>
-              <w:bottom w:val="none"/>
-            </w:tcBorders>
-          </w:tcPr>
-          <w:p>
-            <w:pPr>
-              <w:spacing w:before="40" w:after="80"/>
-            </w:pPr>
-            <w:r>
-              <w:rPr>
-                <w:b/>
-                <w:color w:val="0F172A"/>
-                <w:sz w:val="21"/>
-              </w:rPr>
-              <w:t>★ Q2: What is the specific role of Helmet.js in your Express application?</w:t>
-              <w:br/>
-            </w:r>
-            <w:r>
-              <w:rPr>
-                <w:color w:val="334155"/>
-                <w:sz w:val="19"/>
-              </w:rPr>
-              <w:t>A2: Express by default leaks the 'X-Powered-By: Express' header and omits browser security directives. Helmet configures 15 security sub-middlewares setting standard HTTP response headers: X-Frame-Options: DENY protects against Clickjacking; X-Content-Type-Options: nosniff prevents MIME spoofing; Strict-Transport-Security enforces HTTPS; and Content-Security-Policy (CSP) restricts unauthorized scripts, mitigating XSS.</w:t>
-            </w:r>
-          </w:p>
-        </w:tc>
-      </w:tr>
-    </w:tbl>
-    <w:p/>
-    <w:tbl>
-      <w:tblPr>
-        <w:tblW w:type="auto" w:w="0"/>
-        <w:jc w:val="center"/>
-        <w:tblLook w:firstColumn="1" w:firstRow="1" w:lastColumn="0" w:lastRow="0" w:noHBand="0" w:noVBand="1" w:val="04A0"/>
-      </w:tblPr>
-      <w:tblGrid>
-        <w:gridCol w:w="9360"/>
-      </w:tblGrid>
-      <w:tr>
-        <w:tc>
-          <w:tcPr>
-            <w:tcW w:type="dxa" w:w="9360"/>
-            <w:shd w:fill="F0FDF4"/>
-            <w:tcMar>
-              <w:top w:w="140" w:type="dxa"/>
-              <w:bottom w:w="140" w:type="dxa"/>
-              <w:left w:w="200" w:type="dxa"/>
-              <w:right w:w="200" w:type="dxa"/>
-            </w:tcMar>
-            <w:tcBorders>
-              <w:left w:val="single" w:sz="24" w:space="0" w:color="00b4d8"/>
-              <w:top w:val="none"/>
-              <w:right w:val="none"/>
-              <w:bottom w:val="none"/>
-            </w:tcBorders>
-          </w:tcPr>
-          <w:p>
-            <w:pPr>
-              <w:spacing w:before="40" w:after="80"/>
-            </w:pPr>
-            <w:r>
-              <w:rPr>
-                <w:b/>
-                <w:color w:val="0F172A"/>
-                <w:sz w:val="21"/>
-              </w:rPr>
-              <w:t>★ Q3: How does bcrypt prevent Rainbow Table attacks?</w:t>
-              <w:br/>
-            </w:r>
-            <w:r>
-              <w:rPr>
-                <w:color w:val="334155"/>
-                <w:sz w:val="19"/>
-              </w:rPr>
-              <w:t>A3: Rainbow Tables contain precomputed hashes of common passwords. bcrypt generates a unique 128-bit salt for every password before hashing. As demonstrated in our test output, hashing the exact same password twice produces two completely different hashes ($2b$10$FRvg... vs $2b$10$M4jk...). Because salts are unique, attackers cannot use precomputed tables and must compute hashes individually for each user.</w:t>
-            </w:r>
-          </w:p>
-        </w:tc>
-      </w:tr>
-    </w:tbl>
-    <w:p/>
-    <w:tbl>
-      <w:tblPr>
-        <w:tblW w:type="auto" w:w="0"/>
-        <w:jc w:val="center"/>
-        <w:tblLook w:firstColumn="1" w:firstRow="1" w:lastColumn="0" w:lastRow="0" w:noHBand="0" w:noVBand="1" w:val="04A0"/>
-      </w:tblPr>
-      <w:tblGrid>
-        <w:gridCol w:w="9360"/>
-      </w:tblGrid>
-      <w:tr>
-        <w:tc>
-          <w:tcPr>
-            <w:tcW w:type="dxa" w:w="9360"/>
-            <w:shd w:fill="F0FDF4"/>
-            <w:tcMar>
-              <w:top w:w="140" w:type="dxa"/>
-              <w:bottom w:w="140" w:type="dxa"/>
-              <w:left w:w="200" w:type="dxa"/>
-              <w:right w:w="200" w:type="dxa"/>
-            </w:tcMar>
-            <w:tcBorders>
-              <w:left w:val="single" w:sz="24" w:space="0" w:color="00b4d8"/>
-              <w:top w:val="none"/>
-              <w:right w:val="none"/>
-              <w:bottom w:val="none"/>
-            </w:tcBorders>
-          </w:tcPr>
-          <w:p>
-            <w:pPr>
-              <w:spacing w:before="40" w:after="80"/>
-            </w:pPr>
-            <w:r>
-              <w:rPr>
-                <w:b/>
-                <w:color w:val="0F172A"/>
-                <w:sz w:val="21"/>
-              </w:rPr>
-              <w:t>★ Q4: Why use Joi validation middleware instead of relying solely on Mongoose schema validation?</w:t>
-              <w:br/>
-            </w:r>
-            <w:r>
-              <w:rPr>
-                <w:color w:val="334155"/>
-                <w:sz w:val="19"/>
-              </w:rPr>
-              <w:t>A4: Mongoose validation only runs when saving to MongoDB at the database layer. Joi acts as gateway validation at the HTTP middleware layer before data reaches controllers. Joi provides mass-assignment protection (stripUnknown: true), coerces types, validates query strings (e.g., page, limit), and returns detailed, aggregated HTTP 400 error arrays without burdening database connections.</w:t>
-            </w:r>
-          </w:p>
-        </w:tc>
-      </w:tr>
-    </w:tbl>
-    <w:p/>
-    <w:tbl>
-      <w:tblPr>
-        <w:tblW w:type="auto" w:w="0"/>
-        <w:jc w:val="center"/>
-        <w:tblLook w:firstColumn="1" w:firstRow="1" w:lastColumn="0" w:lastRow="0" w:noHBand="0" w:noVBand="1" w:val="04A0"/>
-      </w:tblPr>
-      <w:tblGrid>
-        <w:gridCol w:w="9360"/>
-      </w:tblGrid>
-      <w:tr>
-        <w:tc>
-          <w:tcPr>
-            <w:tcW w:type="dxa" w:w="9360"/>
-            <w:shd w:fill="F0FDF4"/>
-            <w:tcMar>
-              <w:top w:w="140" w:type="dxa"/>
-              <w:bottom w:w="140" w:type="dxa"/>
-              <w:left w:w="200" w:type="dxa"/>
-              <w:right w:w="200" w:type="dxa"/>
-            </w:tcMar>
-            <w:tcBorders>
-              <w:left w:val="single" w:sz="24" w:space="0" w:color="00b4d8"/>
-              <w:top w:val="none"/>
-              <w:right w:val="none"/>
-              <w:bottom w:val="none"/>
-            </w:tcBorders>
-          </w:tcPr>
-          <w:p>
-            <w:pPr>
-              <w:spacing w:before="40" w:after="80"/>
-            </w:pPr>
-            <w:r>
-              <w:rPr>
-                <w:b/>
-                <w:color w:val="0F172A"/>
-                <w:sz w:val="21"/>
-              </w:rPr>
-              <w:t>★ Q5: What makes your application resilient if MongoDB or the backend is offline?</w:t>
-              <w:br/>
-            </w:r>
-            <w:r>
-              <w:rPr>
-                <w:color w:val="334155"/>
-                <w:sz w:val="19"/>
-              </w:rPr>
-              <w:t>A5: Our client API service (client/src/services/api.js) implements an offline fallback architecture. If Axios encounters a network timeout or connection refused error, it automatically activates local mock data filtering with 17 complete opportunity records and displays a 'Demo Mode' badge in the UI, ensuring zero white-screen crashes during viva evaluation.</w:t>
-            </w:r>
-          </w:p>
-        </w:tc>
-      </w:tr>
-    </w:tbl>
-    <w:p/>
     <w:sectPr>
       <w:pgSz w:w="12240" w:h="15840"/>
       <w:pgMar w:top="1440" w:right="1440" w:bottom="1440" w:left="1440" w:header="720" w:footer="720" w:gutter="0"/>
@@ -4266,11 +950,6 @@
     <w:name w:val="Normal"/>
     <w:qFormat/>
     <w:rsid w:val="00FC693F"/>
-    <w:rPr>
-      <w:rFonts w:ascii="Calibri" w:hAnsi="Calibri"/>
-      <w:color w:val="1E293B"/>
-      <w:sz w:val="21"/>
-    </w:rPr>
   </w:style>
   <w:style w:type="paragraph" w:styleId="Header">
     <w:name w:val="header"/>

</xml_diff>